<commit_message>
fix: resolve document upload error caused by non-ascii file names in storage path
</commit_message>
<xml_diff>
--- a/docs/BaoCaoDeTaiStudyAI.docx
+++ b/docs/BaoCaoDeTaiStudyAI.docx
@@ -533,22 +533,30 @@
         <w:jc w:val="center"/>
         <w:rPr>
           <w:b/>
-        </w:rPr>
-      </w:pPr>
+          <w:sz w:val="26"/>
+        </w:rPr>
+      </w:pPr>
+      <w:r>
+        <w:rPr>
+          <w:b/>
+          <w:sz w:val="26"/>
+        </w:rPr>
+        <w:t>ĐƯỜNG DẪN DEMO TRỰC TUYẾN</w:t>
+      </w:r>
     </w:p>
     <w:p>
       <w:pPr>
         <w:ind w:firstLine="0"/>
         <w:jc w:val="center"/>
         <w:rPr>
-          <w:b/>
-        </w:rPr>
-      </w:pPr>
-      <w:r>
-        <w:rPr>
-          <w:b/>
-        </w:rPr>
-        <w:t>HUẾ - 2026</w:t>
+          <w:sz w:val="26"/>
+        </w:rPr>
+      </w:pPr>
+      <w:r>
+        <w:rPr>
+          <w:sz w:val="26"/>
+        </w:rPr>
+        <w:t>https://study-ai-app-one.vercel.app/</w:t>
       </w:r>
     </w:p>
     <w:p>
@@ -556,9 +564,53 @@
         <w:ind w:firstLine="0"/>
         <w:jc w:val="center"/>
         <w:rPr>
+          <w:sz w:val="26"/>
+        </w:rPr>
+      </w:pPr>
+    </w:p>
+    <w:p>
+      <w:pPr>
+        <w:ind w:firstLine="0"/>
+        <w:jc w:val="center"/>
+        <w:rPr>
+          <w:sz w:val="26"/>
+        </w:rPr>
+      </w:pPr>
+    </w:p>
+    <w:p>
+      <w:pPr>
+        <w:ind w:firstLine="0"/>
+        <w:jc w:val="center"/>
+        <w:rPr>
+          <w:sz w:val="26"/>
+        </w:rPr>
+      </w:pPr>
+    </w:p>
+    <w:p>
+      <w:pPr>
+        <w:ind w:firstLine="0"/>
+        <w:jc w:val="center"/>
+        <w:rPr>
           <w:b/>
         </w:rPr>
+      </w:pPr>
+      <w:r>
+        <w:rPr>
+          <w:b/>
+        </w:rPr>
+        <w:t>HUẾ - 2026</w:t>
+      </w:r>
+    </w:p>
+    <w:p>
+      <w:pPr>
+        <w:ind w:firstLine="0"/>
+        <w:jc w:val="center"/>
+        <w:rPr>
+          <w:b/>
+        </w:rPr>
         <w:sectPr>
+          <w:headerReference w:type="default" r:id="rId12"/>
+          <w:footerReference w:type="default" r:id="rId13"/>
           <w:pgSz w:w="11907" w:h="16839"/>
           <w:pgMar w:top="1134" w:right="1134" w:bottom="1134" w:left="1984" w:header="720" w:footer="720" w:gutter="0"/>
           <w:cols w:space="720"/>
@@ -570,7 +622,7 @@
       <w:pPr>
         <w:pStyle w:val="Heading1"/>
       </w:pPr>
-      <w:bookmarkStart w:id="0" w:name="_Toc235302259"/>
+      <w:bookmarkStart w:id="0" w:name="_Toc238244671"/>
       <w:r>
         <w:lastRenderedPageBreak/>
         <w:t>LỜI CAM ĐOAN</w:t>
@@ -673,7 +725,7 @@
       <w:pPr>
         <w:pStyle w:val="Heading1"/>
       </w:pPr>
-      <w:bookmarkStart w:id="1" w:name="_Toc235302260"/>
+      <w:bookmarkStart w:id="1" w:name="_Toc238244672"/>
       <w:r>
         <w:lastRenderedPageBreak/>
         <w:t>LỜI CẢM ƠN</w:t>
@@ -781,7 +833,7 @@
       <w:pPr>
         <w:pStyle w:val="Heading1"/>
       </w:pPr>
-      <w:bookmarkStart w:id="2" w:name="_Toc235302261"/>
+      <w:bookmarkStart w:id="2" w:name="_Toc238244673"/>
       <w:r>
         <w:lastRenderedPageBreak/>
         <w:t>BẢNG CHỮ CÁI VIẾT TẮT</w:t>
@@ -1613,7 +1665,7 @@
       <w:pPr>
         <w:pStyle w:val="Heading1"/>
       </w:pPr>
-      <w:bookmarkStart w:id="3" w:name="_Toc235302262"/>
+      <w:bookmarkStart w:id="3" w:name="_Toc238244674"/>
       <w:r>
         <w:lastRenderedPageBreak/>
         <w:t>DANH MỤC CÁC HÌNH</w:t>
@@ -1688,7 +1740,7 @@
       <w:pPr>
         <w:pStyle w:val="Heading1"/>
       </w:pPr>
-      <w:bookmarkStart w:id="4" w:name="_Toc235302263"/>
+      <w:bookmarkStart w:id="4" w:name="_Toc238244675"/>
       <w:r>
         <w:lastRenderedPageBreak/>
         <w:t>DANH MỤC CÁC BẢNG</w:t>
@@ -1808,7 +1860,7 @@
       <w:pPr>
         <w:pStyle w:val="Heading1"/>
       </w:pPr>
-      <w:bookmarkStart w:id="5" w:name="_Toc235302264"/>
+      <w:bookmarkStart w:id="5" w:name="_Toc238244676"/>
       <w:r>
         <w:lastRenderedPageBreak/>
         <w:t>MỤC LỤC</w:t>
@@ -1858,7 +1910,7 @@
         <w:rPr>
           <w:noProof/>
         </w:rPr>
-        <w:instrText xml:space="preserve"> PAGEREF _Toc235302259 \h </w:instrText>
+        <w:instrText xml:space="preserve"> PAGEREF _Toc238244671 \h </w:instrText>
       </w:r>
       <w:r>
         <w:rPr>
@@ -1918,7 +1970,7 @@
         <w:rPr>
           <w:noProof/>
         </w:rPr>
-        <w:instrText xml:space="preserve"> PAGEREF _Toc235302260 \h </w:instrText>
+        <w:instrText xml:space="preserve"> PAGEREF _Toc238244672 \h </w:instrText>
       </w:r>
       <w:r>
         <w:rPr>
@@ -1978,7 +2030,7 @@
         <w:rPr>
           <w:noProof/>
         </w:rPr>
-        <w:instrText xml:space="preserve"> PAGEREF _Toc235302261 \h </w:instrText>
+        <w:instrText xml:space="preserve"> PAGEREF _Toc238244673 \h </w:instrText>
       </w:r>
       <w:r>
         <w:rPr>
@@ -2038,7 +2090,7 @@
         <w:rPr>
           <w:noProof/>
         </w:rPr>
-        <w:instrText xml:space="preserve"> PAGEREF _Toc235302262 \h </w:instrText>
+        <w:instrText xml:space="preserve"> PAGEREF _Toc238244674 \h </w:instrText>
       </w:r>
       <w:r>
         <w:rPr>
@@ -2098,7 +2150,7 @@
         <w:rPr>
           <w:noProof/>
         </w:rPr>
-        <w:instrText xml:space="preserve"> PAGEREF _Toc235302263 \h </w:instrText>
+        <w:instrText xml:space="preserve"> PAGEREF _Toc238244675 \h </w:instrText>
       </w:r>
       <w:r>
         <w:rPr>
@@ -2158,7 +2210,7 @@
         <w:rPr>
           <w:noProof/>
         </w:rPr>
-        <w:instrText xml:space="preserve"> PAGEREF _Toc235302264 \h </w:instrText>
+        <w:instrText xml:space="preserve"> PAGEREF _Toc238244676 \h </w:instrText>
       </w:r>
       <w:r>
         <w:rPr>
@@ -2218,7 +2270,7 @@
         <w:rPr>
           <w:noProof/>
         </w:rPr>
-        <w:instrText xml:space="preserve"> PAGEREF _Toc235302265 \h </w:instrText>
+        <w:instrText xml:space="preserve"> PAGEREF _Toc238244677 \h </w:instrText>
       </w:r>
       <w:r>
         <w:rPr>
@@ -2276,7 +2328,7 @@
         <w:rPr>
           <w:noProof/>
         </w:rPr>
-        <w:instrText xml:space="preserve"> PAGEREF _Toc235302266 \h </w:instrText>
+        <w:instrText xml:space="preserve"> PAGEREF _Toc238244678 \h </w:instrText>
       </w:r>
       <w:r>
         <w:rPr>
@@ -2334,7 +2386,7 @@
         <w:rPr>
           <w:noProof/>
         </w:rPr>
-        <w:instrText xml:space="preserve"> PAGEREF _Toc235302267 \h </w:instrText>
+        <w:instrText xml:space="preserve"> PAGEREF _Toc238244679 \h </w:instrText>
       </w:r>
       <w:r>
         <w:rPr>
@@ -2392,7 +2444,7 @@
         <w:rPr>
           <w:noProof/>
         </w:rPr>
-        <w:instrText xml:space="preserve"> PAGEREF _Toc235302268 \h </w:instrText>
+        <w:instrText xml:space="preserve"> PAGEREF _Toc238244680 \h </w:instrText>
       </w:r>
       <w:r>
         <w:rPr>
@@ -2450,7 +2502,7 @@
         <w:rPr>
           <w:noProof/>
         </w:rPr>
-        <w:instrText xml:space="preserve"> PAGEREF _Toc235302269 \h </w:instrText>
+        <w:instrText xml:space="preserve"> PAGEREF _Toc238244681 \h </w:instrText>
       </w:r>
       <w:r>
         <w:rPr>
@@ -2508,7 +2560,7 @@
         <w:rPr>
           <w:noProof/>
         </w:rPr>
-        <w:instrText xml:space="preserve"> PAGEREF _Toc235302270 \h </w:instrText>
+        <w:instrText xml:space="preserve"> PAGEREF _Toc238244682 \h </w:instrText>
       </w:r>
       <w:r>
         <w:rPr>
@@ -2566,7 +2618,7 @@
         <w:rPr>
           <w:noProof/>
         </w:rPr>
-        <w:instrText xml:space="preserve"> PAGEREF _Toc235302271 \h </w:instrText>
+        <w:instrText xml:space="preserve"> PAGEREF _Toc238244683 \h </w:instrText>
       </w:r>
       <w:r>
         <w:rPr>
@@ -2626,7 +2678,7 @@
         <w:rPr>
           <w:noProof/>
         </w:rPr>
-        <w:instrText xml:space="preserve"> PAGEREF _Toc235302272 \h </w:instrText>
+        <w:instrText xml:space="preserve"> PAGEREF _Toc238244684 \h </w:instrText>
       </w:r>
       <w:r>
         <w:rPr>
@@ -2684,7 +2736,7 @@
         <w:rPr>
           <w:noProof/>
         </w:rPr>
-        <w:instrText xml:space="preserve"> PAGEREF _Toc235302273 \h </w:instrText>
+        <w:instrText xml:space="preserve"> PAGEREF _Toc238244685 \h </w:instrText>
       </w:r>
       <w:r>
         <w:rPr>
@@ -2742,7 +2794,7 @@
         <w:rPr>
           <w:noProof/>
         </w:rPr>
-        <w:instrText xml:space="preserve"> PAGEREF _Toc235302274 \h </w:instrText>
+        <w:instrText xml:space="preserve"> PAGEREF _Toc238244686 \h </w:instrText>
       </w:r>
       <w:r>
         <w:rPr>
@@ -2800,7 +2852,7 @@
         <w:rPr>
           <w:noProof/>
         </w:rPr>
-        <w:instrText xml:space="preserve"> PAGEREF _Toc235302275 \h </w:instrText>
+        <w:instrText xml:space="preserve"> PAGEREF _Toc238244687 \h </w:instrText>
       </w:r>
       <w:r>
         <w:rPr>
@@ -2858,7 +2910,7 @@
         <w:rPr>
           <w:noProof/>
         </w:rPr>
-        <w:instrText xml:space="preserve"> PAGEREF _Toc235302276 \h </w:instrText>
+        <w:instrText xml:space="preserve"> PAGEREF _Toc238244688 \h </w:instrText>
       </w:r>
       <w:r>
         <w:rPr>
@@ -2916,7 +2968,7 @@
         <w:rPr>
           <w:noProof/>
         </w:rPr>
-        <w:instrText xml:space="preserve"> PAGEREF _Toc235302277 \h </w:instrText>
+        <w:instrText xml:space="preserve"> PAGEREF _Toc238244689 \h </w:instrText>
       </w:r>
       <w:r>
         <w:rPr>
@@ -2974,7 +3026,7 @@
         <w:rPr>
           <w:noProof/>
         </w:rPr>
-        <w:instrText xml:space="preserve"> PAGEREF _Toc235302278 \h </w:instrText>
+        <w:instrText xml:space="preserve"> PAGEREF _Toc238244690 \h </w:instrText>
       </w:r>
       <w:r>
         <w:rPr>
@@ -3032,7 +3084,7 @@
         <w:rPr>
           <w:noProof/>
         </w:rPr>
-        <w:instrText xml:space="preserve"> PAGEREF _Toc235302279 \h </w:instrText>
+        <w:instrText xml:space="preserve"> PAGEREF _Toc238244691 \h </w:instrText>
       </w:r>
       <w:r>
         <w:rPr>
@@ -3090,7 +3142,7 @@
         <w:rPr>
           <w:noProof/>
         </w:rPr>
-        <w:instrText xml:space="preserve"> PAGEREF _Toc235302280 \h </w:instrText>
+        <w:instrText xml:space="preserve"> PAGEREF _Toc238244692 \h </w:instrText>
       </w:r>
       <w:r>
         <w:rPr>
@@ -3148,7 +3200,7 @@
         <w:rPr>
           <w:noProof/>
         </w:rPr>
-        <w:instrText xml:space="preserve"> PAGEREF _Toc235302281 \h </w:instrText>
+        <w:instrText xml:space="preserve"> PAGEREF _Toc238244693 \h </w:instrText>
       </w:r>
       <w:r>
         <w:rPr>
@@ -3206,7 +3258,7 @@
         <w:rPr>
           <w:noProof/>
         </w:rPr>
-        <w:instrText xml:space="preserve"> PAGEREF _Toc235302282 \h </w:instrText>
+        <w:instrText xml:space="preserve"> PAGEREF _Toc238244694 \h </w:instrText>
       </w:r>
       <w:r>
         <w:rPr>
@@ -3265,7 +3317,7 @@
         <w:rPr>
           <w:noProof/>
         </w:rPr>
-        <w:instrText xml:space="preserve"> PAGEREF _Toc235302283 \h </w:instrText>
+        <w:instrText xml:space="preserve"> PAGEREF _Toc238244695 \h </w:instrText>
       </w:r>
       <w:r>
         <w:rPr>
@@ -3323,7 +3375,7 @@
         <w:rPr>
           <w:noProof/>
         </w:rPr>
-        <w:instrText xml:space="preserve"> PAGEREF _Toc235302284 \h </w:instrText>
+        <w:instrText xml:space="preserve"> PAGEREF _Toc238244696 \h </w:instrText>
       </w:r>
       <w:r>
         <w:rPr>
@@ -3381,7 +3433,7 @@
         <w:rPr>
           <w:noProof/>
         </w:rPr>
-        <w:instrText xml:space="preserve"> PAGEREF _Toc235302285 \h </w:instrText>
+        <w:instrText xml:space="preserve"> PAGEREF _Toc238244697 \h </w:instrText>
       </w:r>
       <w:r>
         <w:rPr>
@@ -3439,7 +3491,7 @@
         <w:rPr>
           <w:noProof/>
         </w:rPr>
-        <w:instrText xml:space="preserve"> PAGEREF _Toc235302286 \h </w:instrText>
+        <w:instrText xml:space="preserve"> PAGEREF _Toc238244698 \h </w:instrText>
       </w:r>
       <w:r>
         <w:rPr>
@@ -3497,7 +3549,7 @@
         <w:rPr>
           <w:noProof/>
         </w:rPr>
-        <w:instrText xml:space="preserve"> PAGEREF _Toc235302287 \h </w:instrText>
+        <w:instrText xml:space="preserve"> PAGEREF _Toc238244699 \h </w:instrText>
       </w:r>
       <w:r>
         <w:rPr>
@@ -3555,7 +3607,7 @@
         <w:rPr>
           <w:noProof/>
         </w:rPr>
-        <w:instrText xml:space="preserve"> PAGEREF _Toc235302288 \h </w:instrText>
+        <w:instrText xml:space="preserve"> PAGEREF _Toc238244700 \h </w:instrText>
       </w:r>
       <w:r>
         <w:rPr>
@@ -3613,7 +3665,7 @@
         <w:rPr>
           <w:noProof/>
         </w:rPr>
-        <w:instrText xml:space="preserve"> PAGEREF _Toc235302289 \h </w:instrText>
+        <w:instrText xml:space="preserve"> PAGEREF _Toc238244701 \h </w:instrText>
       </w:r>
       <w:r>
         <w:rPr>
@@ -3671,7 +3723,7 @@
         <w:rPr>
           <w:noProof/>
         </w:rPr>
-        <w:instrText xml:space="preserve"> PAGEREF _Toc235302290 \h </w:instrText>
+        <w:instrText xml:space="preserve"> PAGEREF _Toc238244702 \h </w:instrText>
       </w:r>
       <w:r>
         <w:rPr>
@@ -3729,7 +3781,7 @@
         <w:rPr>
           <w:noProof/>
         </w:rPr>
-        <w:instrText xml:space="preserve"> PAGEREF _Toc235302291 \h </w:instrText>
+        <w:instrText xml:space="preserve"> PAGEREF _Toc238244703 \h </w:instrText>
       </w:r>
       <w:r>
         <w:rPr>
@@ -3787,7 +3839,7 @@
         <w:rPr>
           <w:noProof/>
         </w:rPr>
-        <w:instrText xml:space="preserve"> PAGEREF _Toc235302292 \h </w:instrText>
+        <w:instrText xml:space="preserve"> PAGEREF _Toc238244704 \h </w:instrText>
       </w:r>
       <w:r>
         <w:rPr>
@@ -3845,7 +3897,7 @@
         <w:rPr>
           <w:noProof/>
         </w:rPr>
-        <w:instrText xml:space="preserve"> PAGEREF _Toc235302293 \h </w:instrText>
+        <w:instrText xml:space="preserve"> PAGEREF _Toc238244705 \h </w:instrText>
       </w:r>
       <w:r>
         <w:rPr>
@@ -3903,7 +3955,7 @@
         <w:rPr>
           <w:noProof/>
         </w:rPr>
-        <w:instrText xml:space="preserve"> PAGEREF _Toc235302294 \h </w:instrText>
+        <w:instrText xml:space="preserve"> PAGEREF _Toc238244706 \h </w:instrText>
       </w:r>
       <w:r>
         <w:rPr>
@@ -3961,7 +4013,7 @@
         <w:rPr>
           <w:noProof/>
         </w:rPr>
-        <w:instrText xml:space="preserve"> PAGEREF _Toc235302295 \h </w:instrText>
+        <w:instrText xml:space="preserve"> PAGEREF _Toc238244707 \h </w:instrText>
       </w:r>
       <w:r>
         <w:rPr>
@@ -4019,7 +4071,7 @@
         <w:rPr>
           <w:noProof/>
         </w:rPr>
-        <w:instrText xml:space="preserve"> PAGEREF _Toc235302296 \h </w:instrText>
+        <w:instrText xml:space="preserve"> PAGEREF _Toc238244708 \h </w:instrText>
       </w:r>
       <w:r>
         <w:rPr>
@@ -4077,7 +4129,7 @@
         <w:rPr>
           <w:noProof/>
         </w:rPr>
-        <w:instrText xml:space="preserve"> PAGEREF _Toc235302297 \h </w:instrText>
+        <w:instrText xml:space="preserve"> PAGEREF _Toc238244709 \h </w:instrText>
       </w:r>
       <w:r>
         <w:rPr>
@@ -4137,7 +4189,7 @@
         <w:rPr>
           <w:noProof/>
         </w:rPr>
-        <w:instrText xml:space="preserve"> PAGEREF _Toc235302298 \h </w:instrText>
+        <w:instrText xml:space="preserve"> PAGEREF _Toc238244710 \h </w:instrText>
       </w:r>
       <w:r>
         <w:rPr>
@@ -4195,7 +4247,7 @@
         <w:rPr>
           <w:noProof/>
         </w:rPr>
-        <w:instrText xml:space="preserve"> PAGEREF _Toc235302299 \h </w:instrText>
+        <w:instrText xml:space="preserve"> PAGEREF _Toc238244711 \h </w:instrText>
       </w:r>
       <w:r>
         <w:rPr>
@@ -4253,7 +4305,7 @@
         <w:rPr>
           <w:noProof/>
         </w:rPr>
-        <w:instrText xml:space="preserve"> PAGEREF _Toc235302300 \h </w:instrText>
+        <w:instrText xml:space="preserve"> PAGEREF _Toc238244712 \h </w:instrText>
       </w:r>
       <w:r>
         <w:rPr>
@@ -4311,7 +4363,7 @@
         <w:rPr>
           <w:noProof/>
         </w:rPr>
-        <w:instrText xml:space="preserve"> PAGEREF _Toc235302301 \h </w:instrText>
+        <w:instrText xml:space="preserve"> PAGEREF _Toc238244713 \h </w:instrText>
       </w:r>
       <w:r>
         <w:rPr>
@@ -4369,7 +4421,7 @@
         <w:rPr>
           <w:noProof/>
         </w:rPr>
-        <w:instrText xml:space="preserve"> PAGEREF _Toc235302302 \h </w:instrText>
+        <w:instrText xml:space="preserve"> PAGEREF _Toc238244714 \h </w:instrText>
       </w:r>
       <w:r>
         <w:rPr>
@@ -4427,7 +4479,7 @@
         <w:rPr>
           <w:noProof/>
         </w:rPr>
-        <w:instrText xml:space="preserve"> PAGEREF _Toc235302303 \h </w:instrText>
+        <w:instrText xml:space="preserve"> PAGEREF _Toc238244715 \h </w:instrText>
       </w:r>
       <w:r>
         <w:rPr>
@@ -4485,7 +4537,7 @@
         <w:rPr>
           <w:noProof/>
         </w:rPr>
-        <w:instrText xml:space="preserve"> PAGEREF _Toc235302304 \h </w:instrText>
+        <w:instrText xml:space="preserve"> PAGEREF _Toc238244716 \h </w:instrText>
       </w:r>
       <w:r>
         <w:rPr>
@@ -4543,7 +4595,7 @@
         <w:rPr>
           <w:noProof/>
         </w:rPr>
-        <w:instrText xml:space="preserve"> PAGEREF _Toc235302305 \h </w:instrText>
+        <w:instrText xml:space="preserve"> PAGEREF _Toc238244717 \h </w:instrText>
       </w:r>
       <w:r>
         <w:rPr>
@@ -4601,7 +4653,7 @@
         <w:rPr>
           <w:noProof/>
         </w:rPr>
-        <w:instrText xml:space="preserve"> PAGEREF _Toc235302306 \h </w:instrText>
+        <w:instrText xml:space="preserve"> PAGEREF _Toc238244718 \h </w:instrText>
       </w:r>
       <w:r>
         <w:rPr>
@@ -4659,7 +4711,7 @@
         <w:rPr>
           <w:noProof/>
         </w:rPr>
-        <w:instrText xml:space="preserve"> PAGEREF _Toc235302307 \h </w:instrText>
+        <w:instrText xml:space="preserve"> PAGEREF _Toc238244719 \h </w:instrText>
       </w:r>
       <w:r>
         <w:rPr>
@@ -4718,7 +4770,7 @@
         <w:rPr>
           <w:noProof/>
         </w:rPr>
-        <w:instrText xml:space="preserve"> PAGEREF _Toc235302308 \h </w:instrText>
+        <w:instrText xml:space="preserve"> PAGEREF _Toc238244720 \h </w:instrText>
       </w:r>
       <w:r>
         <w:rPr>
@@ -4776,7 +4828,7 @@
         <w:rPr>
           <w:noProof/>
         </w:rPr>
-        <w:instrText xml:space="preserve"> PAGEREF _Toc235302309 \h </w:instrText>
+        <w:instrText xml:space="preserve"> PAGEREF _Toc238244721 \h </w:instrText>
       </w:r>
       <w:r>
         <w:rPr>
@@ -4834,7 +4886,7 @@
         <w:rPr>
           <w:noProof/>
         </w:rPr>
-        <w:instrText xml:space="preserve"> PAGEREF _Toc235302310 \h </w:instrText>
+        <w:instrText xml:space="preserve"> PAGEREF _Toc238244722 \h </w:instrText>
       </w:r>
       <w:r>
         <w:rPr>
@@ -4892,7 +4944,7 @@
         <w:rPr>
           <w:noProof/>
         </w:rPr>
-        <w:instrText xml:space="preserve"> PAGEREF _Toc235302311 \h </w:instrText>
+        <w:instrText xml:space="preserve"> PAGEREF _Toc238244723 \h </w:instrText>
       </w:r>
       <w:r>
         <w:rPr>
@@ -4952,7 +5004,7 @@
         <w:rPr>
           <w:noProof/>
         </w:rPr>
-        <w:instrText xml:space="preserve"> PAGEREF _Toc235302312 \h </w:instrText>
+        <w:instrText xml:space="preserve"> PAGEREF _Toc238244724 \h </w:instrText>
       </w:r>
       <w:r>
         <w:rPr>
@@ -5010,7 +5062,7 @@
         <w:rPr>
           <w:noProof/>
         </w:rPr>
-        <w:instrText xml:space="preserve"> PAGEREF _Toc235302313 \h </w:instrText>
+        <w:instrText xml:space="preserve"> PAGEREF _Toc238244725 \h </w:instrText>
       </w:r>
       <w:r>
         <w:rPr>
@@ -5068,7 +5120,7 @@
         <w:rPr>
           <w:noProof/>
         </w:rPr>
-        <w:instrText xml:space="preserve"> PAGEREF _Toc235302314 \h </w:instrText>
+        <w:instrText xml:space="preserve"> PAGEREF _Toc238244726 \h </w:instrText>
       </w:r>
       <w:r>
         <w:rPr>
@@ -5126,7 +5178,7 @@
         <w:rPr>
           <w:noProof/>
         </w:rPr>
-        <w:instrText xml:space="preserve"> PAGEREF _Toc235302315 \h </w:instrText>
+        <w:instrText xml:space="preserve"> PAGEREF _Toc238244727 \h </w:instrText>
       </w:r>
       <w:r>
         <w:rPr>
@@ -5184,7 +5236,7 @@
         <w:rPr>
           <w:noProof/>
         </w:rPr>
-        <w:instrText xml:space="preserve"> PAGEREF _Toc235302316 \h </w:instrText>
+        <w:instrText xml:space="preserve"> PAGEREF _Toc238244728 \h </w:instrText>
       </w:r>
       <w:r>
         <w:rPr>
@@ -5201,7 +5253,7 @@
         <w:rPr>
           <w:noProof/>
         </w:rPr>
-        <w:t>21</w:t>
+        <w:t>22</w:t>
       </w:r>
       <w:r>
         <w:rPr>
@@ -5242,7 +5294,7 @@
         <w:rPr>
           <w:noProof/>
         </w:rPr>
-        <w:instrText xml:space="preserve"> PAGEREF _Toc235302317 \h </w:instrText>
+        <w:instrText xml:space="preserve"> PAGEREF _Toc238244729 \h </w:instrText>
       </w:r>
       <w:r>
         <w:rPr>
@@ -5300,7 +5352,7 @@
         <w:rPr>
           <w:noProof/>
         </w:rPr>
-        <w:instrText xml:space="preserve"> PAGEREF _Toc235302318 \h </w:instrText>
+        <w:instrText xml:space="preserve"> PAGEREF _Toc238244730 \h </w:instrText>
       </w:r>
       <w:r>
         <w:rPr>
@@ -5358,7 +5410,7 @@
         <w:rPr>
           <w:noProof/>
         </w:rPr>
-        <w:instrText xml:space="preserve"> PAGEREF _Toc235302319 \h </w:instrText>
+        <w:instrText xml:space="preserve"> PAGEREF _Toc238244731 \h </w:instrText>
       </w:r>
       <w:r>
         <w:rPr>
@@ -5375,7 +5427,7 @@
         <w:rPr>
           <w:noProof/>
         </w:rPr>
-        <w:t>24</w:t>
+        <w:t>25</w:t>
       </w:r>
       <w:r>
         <w:rPr>
@@ -5416,7 +5468,7 @@
         <w:rPr>
           <w:noProof/>
         </w:rPr>
-        <w:instrText xml:space="preserve"> PAGEREF _Toc235302320 \h </w:instrText>
+        <w:instrText xml:space="preserve"> PAGEREF _Toc238244732 \h </w:instrText>
       </w:r>
       <w:r>
         <w:rPr>
@@ -5433,7 +5485,7 @@
         <w:rPr>
           <w:noProof/>
         </w:rPr>
-        <w:t>24</w:t>
+        <w:t>25</w:t>
       </w:r>
       <w:r>
         <w:rPr>
@@ -5474,7 +5526,7 @@
         <w:rPr>
           <w:noProof/>
         </w:rPr>
-        <w:instrText xml:space="preserve"> PAGEREF _Toc235302321 \h </w:instrText>
+        <w:instrText xml:space="preserve"> PAGEREF _Toc238244733 \h </w:instrText>
       </w:r>
       <w:r>
         <w:rPr>
@@ -5532,7 +5584,7 @@
         <w:rPr>
           <w:noProof/>
         </w:rPr>
-        <w:instrText xml:space="preserve"> PAGEREF _Toc235302322 \h </w:instrText>
+        <w:instrText xml:space="preserve"> PAGEREF _Toc238244734 \h </w:instrText>
       </w:r>
       <w:r>
         <w:rPr>
@@ -5549,7 +5601,7 @@
         <w:rPr>
           <w:noProof/>
         </w:rPr>
-        <w:t>25</w:t>
+        <w:t>26</w:t>
       </w:r>
       <w:r>
         <w:rPr>
@@ -5590,7 +5642,7 @@
         <w:rPr>
           <w:noProof/>
         </w:rPr>
-        <w:instrText xml:space="preserve"> PAGEREF _Toc235302323 \h </w:instrText>
+        <w:instrText xml:space="preserve"> PAGEREF _Toc238244735 \h </w:instrText>
       </w:r>
       <w:r>
         <w:rPr>
@@ -5648,7 +5700,7 @@
         <w:rPr>
           <w:noProof/>
         </w:rPr>
-        <w:instrText xml:space="preserve"> PAGEREF _Toc235302324 \h </w:instrText>
+        <w:instrText xml:space="preserve"> PAGEREF _Toc238244736 \h </w:instrText>
       </w:r>
       <w:r>
         <w:rPr>
@@ -5665,7 +5717,7 @@
         <w:rPr>
           <w:noProof/>
         </w:rPr>
-        <w:t>26</w:t>
+        <w:t>27</w:t>
       </w:r>
       <w:r>
         <w:rPr>
@@ -5708,7 +5760,7 @@
         <w:rPr>
           <w:noProof/>
         </w:rPr>
-        <w:instrText xml:space="preserve"> PAGEREF _Toc235302325 \h </w:instrText>
+        <w:instrText xml:space="preserve"> PAGEREF _Toc238244737 \h </w:instrText>
       </w:r>
       <w:r>
         <w:rPr>
@@ -5766,7 +5818,7 @@
         <w:rPr>
           <w:noProof/>
         </w:rPr>
-        <w:instrText xml:space="preserve"> PAGEREF _Toc235302326 \h </w:instrText>
+        <w:instrText xml:space="preserve"> PAGEREF _Toc238244738 \h </w:instrText>
       </w:r>
       <w:r>
         <w:rPr>
@@ -5824,7 +5876,7 @@
         <w:rPr>
           <w:noProof/>
         </w:rPr>
-        <w:instrText xml:space="preserve"> PAGEREF _Toc235302327 \h </w:instrText>
+        <w:instrText xml:space="preserve"> PAGEREF _Toc238244739 \h </w:instrText>
       </w:r>
       <w:r>
         <w:rPr>
@@ -5882,7 +5934,7 @@
         <w:rPr>
           <w:noProof/>
         </w:rPr>
-        <w:instrText xml:space="preserve"> PAGEREF _Toc235302328 \h </w:instrText>
+        <w:instrText xml:space="preserve"> PAGEREF _Toc238244740 \h </w:instrText>
       </w:r>
       <w:r>
         <w:rPr>
@@ -5940,7 +5992,7 @@
         <w:rPr>
           <w:noProof/>
         </w:rPr>
-        <w:instrText xml:space="preserve"> PAGEREF _Toc235302329 \h </w:instrText>
+        <w:instrText xml:space="preserve"> PAGEREF _Toc238244741 \h </w:instrText>
       </w:r>
       <w:r>
         <w:rPr>
@@ -6000,7 +6052,7 @@
         <w:rPr>
           <w:noProof/>
         </w:rPr>
-        <w:instrText xml:space="preserve"> PAGEREF _Toc235302330 \h </w:instrText>
+        <w:instrText xml:space="preserve"> PAGEREF _Toc238244742 \h </w:instrText>
       </w:r>
       <w:r>
         <w:rPr>
@@ -6060,7 +6112,7 @@
         <w:rPr>
           <w:noProof/>
         </w:rPr>
-        <w:instrText xml:space="preserve"> PAGEREF _Toc235302331 \h </w:instrText>
+        <w:instrText xml:space="preserve"> PAGEREF _Toc238244743 \h </w:instrText>
       </w:r>
       <w:r>
         <w:rPr>
@@ -6118,7 +6170,7 @@
         <w:rPr>
           <w:noProof/>
         </w:rPr>
-        <w:instrText xml:space="preserve"> PAGEREF _Toc235302332 \h </w:instrText>
+        <w:instrText xml:space="preserve"> PAGEREF _Toc238244744 \h </w:instrText>
       </w:r>
       <w:r>
         <w:rPr>
@@ -6177,7 +6229,7 @@
         <w:rPr>
           <w:noProof/>
         </w:rPr>
-        <w:instrText xml:space="preserve"> PAGEREF _Toc235302333 \h </w:instrText>
+        <w:instrText xml:space="preserve"> PAGEREF _Toc238244745 \h </w:instrText>
       </w:r>
       <w:r>
         <w:rPr>
@@ -6217,7 +6269,7 @@
         <w:rPr>
           <w:noProof/>
         </w:rPr>
-        <w:t>PHỤ LỤC C. QUY TRÌNH KHỞI CHẠY</w:t>
+        <w:t>PHỤ LỤC C. QUY TRÌNH KHỞI CHẠY VÀ TRẢI NGHIỆM DEMO</w:t>
       </w:r>
       <w:r>
         <w:rPr>
@@ -6235,7 +6287,7 @@
         <w:rPr>
           <w:noProof/>
         </w:rPr>
-        <w:instrText xml:space="preserve"> PAGEREF _Toc235302334 \h </w:instrText>
+        <w:instrText xml:space="preserve"> PAGEREF _Toc238244746 \h </w:instrText>
       </w:r>
       <w:r>
         <w:rPr>
@@ -6269,8 +6321,8 @@
     <w:p>
       <w:pPr>
         <w:sectPr>
-          <w:headerReference w:type="default" r:id="rId12"/>
-          <w:footerReference w:type="default" r:id="rId13"/>
+          <w:headerReference w:type="default" r:id="rId14"/>
+          <w:footerReference w:type="default" r:id="rId15"/>
           <w:pgSz w:w="11907" w:h="16839"/>
           <w:pgMar w:top="1134" w:right="1134" w:bottom="1134" w:left="1984" w:header="720" w:footer="720" w:gutter="0"/>
           <w:pgNumType w:fmt="lowerRoman" w:start="1"/>
@@ -6283,7 +6335,7 @@
       <w:pPr>
         <w:pStyle w:val="Heading1"/>
       </w:pPr>
-      <w:bookmarkStart w:id="6" w:name="_Toc235302265"/>
+      <w:bookmarkStart w:id="6" w:name="_Toc238244677"/>
       <w:r>
         <w:lastRenderedPageBreak/>
         <w:t>CHƯƠNG 1. GIỚI THIỆU ĐỀ TÀI</w:t>
@@ -6294,7 +6346,7 @@
       <w:pPr>
         <w:pStyle w:val="Heading2"/>
       </w:pPr>
-      <w:bookmarkStart w:id="7" w:name="_Toc235302266"/>
+      <w:bookmarkStart w:id="7" w:name="_Toc238244678"/>
       <w:r>
         <w:t>1.1. Lý do chọn đề tài</w:t>
       </w:r>
@@ -6319,7 +6371,7 @@
       <w:pPr>
         <w:pStyle w:val="Heading2"/>
       </w:pPr>
-      <w:bookmarkStart w:id="8" w:name="_Toc235302267"/>
+      <w:bookmarkStart w:id="8" w:name="_Toc238244679"/>
       <w:r>
         <w:t>1.2. Mục tiêu nghiên cứu</w:t>
       </w:r>
@@ -6340,7 +6392,7 @@
       <w:pPr>
         <w:pStyle w:val="Heading2"/>
       </w:pPr>
-      <w:bookmarkStart w:id="9" w:name="_Toc235302268"/>
+      <w:bookmarkStart w:id="9" w:name="_Toc238244680"/>
       <w:r>
         <w:t>1.3. Đối tượng và phạm vi nghiên cứu</w:t>
       </w:r>
@@ -6360,7 +6412,7 @@
       <w:pPr>
         <w:pStyle w:val="Heading2"/>
       </w:pPr>
-      <w:bookmarkStart w:id="10" w:name="_Toc235302269"/>
+      <w:bookmarkStart w:id="10" w:name="_Toc238244681"/>
       <w:r>
         <w:t>1.4. Phương pháp nghiên cứu</w:t>
       </w:r>
@@ -6375,7 +6427,7 @@
       <w:pPr>
         <w:pStyle w:val="Heading2"/>
       </w:pPr>
-      <w:bookmarkStart w:id="11" w:name="_Toc235302270"/>
+      <w:bookmarkStart w:id="11" w:name="_Toc238244682"/>
       <w:r>
         <w:t>1.5. Ý nghĩa khoa học và thực tiễn</w:t>
       </w:r>
@@ -6394,7 +6446,7 @@
       <w:pPr>
         <w:pStyle w:val="Heading2"/>
       </w:pPr>
-      <w:bookmarkStart w:id="12" w:name="_Toc235302271"/>
+      <w:bookmarkStart w:id="12" w:name="_Toc238244683"/>
       <w:r>
         <w:t>1.6. Bố cục khóa luận</w:t>
       </w:r>
@@ -6419,7 +6471,7 @@
       <w:pPr>
         <w:pStyle w:val="Heading1"/>
       </w:pPr>
-      <w:bookmarkStart w:id="13" w:name="_Toc235302272"/>
+      <w:bookmarkStart w:id="13" w:name="_Toc238244684"/>
       <w:r>
         <w:lastRenderedPageBreak/>
         <w:t>CHƯƠNG 2. CƠ SỞ LÝ THUYẾT VÀ CÔNG NGHỆ LIÊN QUAN</w:t>
@@ -6430,7 +6482,7 @@
       <w:pPr>
         <w:pStyle w:val="Heading2"/>
       </w:pPr>
-      <w:bookmarkStart w:id="14" w:name="_Toc235302273"/>
+      <w:bookmarkStart w:id="14" w:name="_Toc238244685"/>
       <w:r>
         <w:t>2.1. Tổng quan bài toán trợ lý học tập cá nhân</w:t>
       </w:r>
@@ -6440,7 +6492,7 @@
       <w:pPr>
         <w:pStyle w:val="Heading3"/>
       </w:pPr>
-      <w:bookmarkStart w:id="15" w:name="_Toc235302274"/>
+      <w:bookmarkStart w:id="15" w:name="_Toc238244686"/>
       <w:r>
         <w:t>2.1.1. Bối cảnh của bài toán</w:t>
       </w:r>
@@ -6460,7 +6512,7 @@
       <w:pPr>
         <w:pStyle w:val="Heading3"/>
       </w:pPr>
-      <w:bookmarkStart w:id="16" w:name="_Toc235302275"/>
+      <w:bookmarkStart w:id="16" w:name="_Toc238244687"/>
       <w:r>
         <w:t>2.1.2. Những hạn chế của cách tiếp cận thông thường</w:t>
       </w:r>
@@ -6480,7 +6532,7 @@
       <w:pPr>
         <w:pStyle w:val="Heading3"/>
       </w:pPr>
-      <w:bookmarkStart w:id="17" w:name="_Toc235302276"/>
+      <w:bookmarkStart w:id="17" w:name="_Toc238244688"/>
       <w:r>
         <w:lastRenderedPageBreak/>
         <w:t>2.1.3. Định hướng giải pháp StudyAI</w:t>
@@ -6501,7 +6553,7 @@
       <w:pPr>
         <w:pStyle w:val="Heading2"/>
       </w:pPr>
-      <w:bookmarkStart w:id="18" w:name="_Toc235302277"/>
+      <w:bookmarkStart w:id="18" w:name="_Toc238244689"/>
       <w:r>
         <w:t>2.2. Trí tuệ nhân tạo và mô hình ngôn ngữ lớn</w:t>
       </w:r>
@@ -6511,7 +6563,7 @@
       <w:pPr>
         <w:pStyle w:val="Heading3"/>
       </w:pPr>
-      <w:bookmarkStart w:id="19" w:name="_Toc235302278"/>
+      <w:bookmarkStart w:id="19" w:name="_Toc238244690"/>
       <w:r>
         <w:t>2.2.1. Khái niệm liên quan</w:t>
       </w:r>
@@ -6531,7 +6583,7 @@
       <w:pPr>
         <w:pStyle w:val="Heading3"/>
       </w:pPr>
-      <w:bookmarkStart w:id="20" w:name="_Toc235302279"/>
+      <w:bookmarkStart w:id="20" w:name="_Toc238244691"/>
       <w:r>
         <w:t>2.2.2. Prompt và sinh nội dung có cấu trúc</w:t>
       </w:r>
@@ -6555,7 +6607,7 @@
       <w:pPr>
         <w:pStyle w:val="Heading2"/>
       </w:pPr>
-      <w:bookmarkStart w:id="21" w:name="_Toc235302280"/>
+      <w:bookmarkStart w:id="21" w:name="_Toc238244692"/>
       <w:r>
         <w:t>2.3. Retrieval-Augmented Generation</w:t>
       </w:r>
@@ -6565,7 +6617,7 @@
       <w:pPr>
         <w:pStyle w:val="Heading3"/>
       </w:pPr>
-      <w:bookmarkStart w:id="22" w:name="_Toc235302281"/>
+      <w:bookmarkStart w:id="22" w:name="_Toc238244693"/>
       <w:r>
         <w:t>2.3.1. Khái niệm RAG</w:t>
       </w:r>
@@ -6585,7 +6637,7 @@
       <w:pPr>
         <w:pStyle w:val="Heading3"/>
       </w:pPr>
-      <w:bookmarkStart w:id="23" w:name="_Toc235302282"/>
+      <w:bookmarkStart w:id="23" w:name="_Toc238244694"/>
       <w:r>
         <w:t>2.3.2. Embedding và không gian vector</w:t>
       </w:r>
@@ -6606,7 +6658,7 @@
       <w:pPr>
         <w:pStyle w:val="Heading3"/>
       </w:pPr>
-      <w:bookmarkStart w:id="24" w:name="_Toc235302283"/>
+      <w:bookmarkStart w:id="24" w:name="_Toc238244695"/>
       <w:r>
         <w:t>2.3.3. Chia đoạn tài liệu</w:t>
       </w:r>
@@ -6626,7 +6678,7 @@
       <w:pPr>
         <w:pStyle w:val="Heading3"/>
       </w:pPr>
-      <w:bookmarkStart w:id="25" w:name="_Toc235302284"/>
+      <w:bookmarkStart w:id="25" w:name="_Toc238244696"/>
       <w:r>
         <w:t>2.3.4. Truy xuất theo độ tương đồng</w:t>
       </w:r>
@@ -6646,7 +6698,7 @@
       <w:pPr>
         <w:pStyle w:val="Heading3"/>
       </w:pPr>
-      <w:bookmarkStart w:id="26" w:name="_Toc235302285"/>
+      <w:bookmarkStart w:id="26" w:name="_Toc238244697"/>
       <w:r>
         <w:lastRenderedPageBreak/>
         <w:t>2.3.5. Lợi ích và giới hạn của RAG</w:t>
@@ -6667,7 +6719,7 @@
       <w:pPr>
         <w:pStyle w:val="Heading2"/>
       </w:pPr>
-      <w:bookmarkStart w:id="27" w:name="_Toc235302286"/>
+      <w:bookmarkStart w:id="27" w:name="_Toc238244698"/>
       <w:r>
         <w:t>2.4. Kiến trúc ứng dụng web và các công nghệ nền tảng</w:t>
       </w:r>
@@ -6677,7 +6729,7 @@
       <w:pPr>
         <w:pStyle w:val="Heading3"/>
       </w:pPr>
-      <w:bookmarkStart w:id="28" w:name="_Toc235302287"/>
+      <w:bookmarkStart w:id="28" w:name="_Toc238244699"/>
       <w:r>
         <w:t>2.4.1. Kiến trúc client-server và REST API</w:t>
       </w:r>
@@ -6697,7 +6749,7 @@
       <w:pPr>
         <w:pStyle w:val="Heading3"/>
       </w:pPr>
-      <w:bookmarkStart w:id="29" w:name="_Toc235302288"/>
+      <w:bookmarkStart w:id="29" w:name="_Toc238244700"/>
       <w:r>
         <w:t>2.4.2. React và Vite ở tầng giao diện</w:t>
       </w:r>
@@ -6721,7 +6773,7 @@
       <w:pPr>
         <w:pStyle w:val="Heading3"/>
       </w:pPr>
-      <w:bookmarkStart w:id="30" w:name="_Toc235302289"/>
+      <w:bookmarkStart w:id="30" w:name="_Toc238244701"/>
       <w:r>
         <w:t>2.4.3. Node.js và Express ở tầng dịch vụ</w:t>
       </w:r>
@@ -6741,7 +6793,7 @@
       <w:pPr>
         <w:pStyle w:val="Heading3"/>
       </w:pPr>
-      <w:bookmarkStart w:id="31" w:name="_Toc235302290"/>
+      <w:bookmarkStart w:id="31" w:name="_Toc238244702"/>
       <w:r>
         <w:t>2.4.4. Supabase PostgreSQL, Storage và pgvector</w:t>
       </w:r>
@@ -6761,7 +6813,7 @@
       <w:pPr>
         <w:pStyle w:val="Heading3"/>
       </w:pPr>
-      <w:bookmarkStart w:id="32" w:name="_Toc235302291"/>
+      <w:bookmarkStart w:id="32" w:name="_Toc238244703"/>
       <w:r>
         <w:lastRenderedPageBreak/>
         <w:t>2.4.5. Gemini API</w:t>
@@ -6782,7 +6834,7 @@
       <w:pPr>
         <w:pStyle w:val="Heading3"/>
       </w:pPr>
-      <w:bookmarkStart w:id="33" w:name="_Toc235302292"/>
+      <w:bookmarkStart w:id="33" w:name="_Toc238244704"/>
       <w:r>
         <w:t>2.4.6. Xác thực và bảo mật API</w:t>
       </w:r>
@@ -6802,7 +6854,7 @@
       <w:pPr>
         <w:pStyle w:val="Heading2"/>
       </w:pPr>
-      <w:bookmarkStart w:id="34" w:name="_Toc235302293"/>
+      <w:bookmarkStart w:id="34" w:name="_Toc238244705"/>
       <w:r>
         <w:t>2.5. Khảo sát và lựa chọn hướng tiếp cận</w:t>
       </w:r>
@@ -7265,7 +7317,7 @@
       <w:pPr>
         <w:pStyle w:val="Heading2"/>
       </w:pPr>
-      <w:bookmarkStart w:id="35" w:name="_Toc235302294"/>
+      <w:bookmarkStart w:id="35" w:name="_Toc238244706"/>
       <w:r>
         <w:t>2.6. Phạm vi chức năng của hệ thống StudyAI</w:t>
       </w:r>
@@ -7825,7 +7877,7 @@
       <w:pPr>
         <w:pStyle w:val="Heading2"/>
       </w:pPr>
-      <w:bookmarkStart w:id="36" w:name="_Toc235302295"/>
+      <w:bookmarkStart w:id="36" w:name="_Toc238244707"/>
       <w:r>
         <w:t>2.7. Kiến trúc tổng thể đề xuất</w:t>
       </w:r>
@@ -7849,7 +7901,7 @@
       <w:pPr>
         <w:pStyle w:val="Heading2"/>
       </w:pPr>
-      <w:bookmarkStart w:id="37" w:name="_Toc235302296"/>
+      <w:bookmarkStart w:id="37" w:name="_Toc238244708"/>
       <w:r>
         <w:t>2.8. Yêu cầu phi chức năng</w:t>
       </w:r>
@@ -8297,7 +8349,7 @@
       <w:pPr>
         <w:pStyle w:val="Heading2"/>
       </w:pPr>
-      <w:bookmarkStart w:id="38" w:name="_Toc235302297"/>
+      <w:bookmarkStart w:id="38" w:name="_Toc238244709"/>
       <w:r>
         <w:t>2.9. Tiểu kết Chương 2</w:t>
       </w:r>
@@ -8326,7 +8378,7 @@
       <w:pPr>
         <w:pStyle w:val="Heading1"/>
       </w:pPr>
-      <w:bookmarkStart w:id="39" w:name="_Toc235302298"/>
+      <w:bookmarkStart w:id="39" w:name="_Toc238244710"/>
       <w:r>
         <w:lastRenderedPageBreak/>
         <w:t>CHƯƠNG 3. PHÂN TÍCH VÀ THIẾT KẾ HỆ THỐNG</w:t>
@@ -8337,7 +8389,7 @@
       <w:pPr>
         <w:pStyle w:val="Heading2"/>
       </w:pPr>
-      <w:bookmarkStart w:id="40" w:name="_Toc235302299"/>
+      <w:bookmarkStart w:id="40" w:name="_Toc238244711"/>
       <w:r>
         <w:t>3.1. Khảo sát và xác định yêu cầu</w:t>
       </w:r>
@@ -8357,7 +8409,7 @@
       <w:pPr>
         <w:pStyle w:val="Heading3"/>
       </w:pPr>
-      <w:bookmarkStart w:id="41" w:name="_Toc235302300"/>
+      <w:bookmarkStart w:id="41" w:name="_Toc238244712"/>
       <w:r>
         <w:t>3.1.1. Yêu cầu chức năng</w:t>
       </w:r>
@@ -9295,7 +9347,7 @@
       <w:pPr>
         <w:pStyle w:val="Heading3"/>
       </w:pPr>
-      <w:bookmarkStart w:id="42" w:name="_Toc235302301"/>
+      <w:bookmarkStart w:id="42" w:name="_Toc238244713"/>
       <w:r>
         <w:t>3.1.2. Yêu cầu phi chức năng</w:t>
       </w:r>
@@ -9315,7 +9367,7 @@
       <w:pPr>
         <w:pStyle w:val="Heading2"/>
       </w:pPr>
-      <w:bookmarkStart w:id="43" w:name="_Toc235302302"/>
+      <w:bookmarkStart w:id="43" w:name="_Toc238244714"/>
       <w:r>
         <w:t>3.2. Tác nhân và trường hợp sử dụng</w:t>
       </w:r>
@@ -10211,7 +10263,7 @@
       <w:pPr>
         <w:pStyle w:val="Heading2"/>
       </w:pPr>
-      <w:bookmarkStart w:id="44" w:name="_Toc235302303"/>
+      <w:bookmarkStart w:id="44" w:name="_Toc238244715"/>
       <w:r>
         <w:t>3.3. Kiến trúc tổng thể</w:t>
       </w:r>
@@ -10319,7 +10371,7 @@
       <w:pPr>
         <w:pStyle w:val="Heading2"/>
       </w:pPr>
-      <w:bookmarkStart w:id="45" w:name="_Toc235302304"/>
+      <w:bookmarkStart w:id="45" w:name="_Toc238244716"/>
       <w:r>
         <w:t>3.4. Thiết kế dữ liệu</w:t>
       </w:r>
@@ -11117,7 +11169,7 @@
       <w:pPr>
         <w:pStyle w:val="Heading2"/>
       </w:pPr>
-      <w:bookmarkStart w:id="46" w:name="_Toc235302305"/>
+      <w:bookmarkStart w:id="46" w:name="_Toc238244717"/>
       <w:r>
         <w:t>3.5. Thiết kế API</w:t>
       </w:r>
@@ -12060,7 +12112,7 @@
       <w:pPr>
         <w:pStyle w:val="Heading2"/>
       </w:pPr>
-      <w:bookmarkStart w:id="47" w:name="_Toc235302306"/>
+      <w:bookmarkStart w:id="47" w:name="_Toc238244718"/>
       <w:r>
         <w:t>3.6. Thiết kế các luồng xử lý chính</w:t>
       </w:r>
@@ -12070,7 +12122,7 @@
       <w:pPr>
         <w:pStyle w:val="Heading3"/>
       </w:pPr>
-      <w:bookmarkStart w:id="48" w:name="_Toc235302307"/>
+      <w:bookmarkStart w:id="48" w:name="_Toc238244719"/>
       <w:r>
         <w:t>3.6.1. Luồng upload và lập chỉ mục</w:t>
       </w:r>
@@ -12085,7 +12137,7 @@
       <w:pPr>
         <w:pStyle w:val="Heading3"/>
       </w:pPr>
-      <w:bookmarkStart w:id="49" w:name="_Toc235302308"/>
+      <w:bookmarkStart w:id="49" w:name="_Toc238244720"/>
       <w:r>
         <w:t>3.6.2. Luồng hỏi đáp RAG</w:t>
       </w:r>
@@ -12136,7 +12188,7 @@
       <w:pPr>
         <w:pStyle w:val="Heading3"/>
       </w:pPr>
-      <w:bookmarkStart w:id="50" w:name="_Toc235302309"/>
+      <w:bookmarkStart w:id="50" w:name="_Toc238244721"/>
       <w:r>
         <w:t>3.6.3. Luồng sinh học liệu và quản lý phiên bản</w:t>
       </w:r>
@@ -12151,7 +12203,7 @@
       <w:pPr>
         <w:pStyle w:val="Heading2"/>
       </w:pPr>
-      <w:bookmarkStart w:id="51" w:name="_Toc235302310"/>
+      <w:bookmarkStart w:id="51" w:name="_Toc238244722"/>
       <w:r>
         <w:t>3.7. Thiết kế bảo mật</w:t>
       </w:r>
@@ -12171,7 +12223,7 @@
       <w:pPr>
         <w:pStyle w:val="Heading2"/>
       </w:pPr>
-      <w:bookmarkStart w:id="52" w:name="_Toc235302311"/>
+      <w:bookmarkStart w:id="52" w:name="_Toc238244723"/>
       <w:r>
         <w:t>3.8. Tiểu kết Chương 3</w:t>
       </w:r>
@@ -12200,7 +12252,7 @@
       <w:pPr>
         <w:pStyle w:val="Heading1"/>
       </w:pPr>
-      <w:bookmarkStart w:id="53" w:name="_Toc235302312"/>
+      <w:bookmarkStart w:id="53" w:name="_Toc238244724"/>
       <w:r>
         <w:lastRenderedPageBreak/>
         <w:t>CHƯƠNG 4. TRIỂN KHAI VÀ KẾT QUẢ THỰC NGHIỆM</w:t>
@@ -12211,7 +12263,7 @@
       <w:pPr>
         <w:pStyle w:val="Heading2"/>
       </w:pPr>
-      <w:bookmarkStart w:id="54" w:name="_Toc235302313"/>
+      <w:bookmarkStart w:id="54" w:name="_Toc238244725"/>
       <w:r>
         <w:t>4.1. Môi trường triển khai</w:t>
       </w:r>
@@ -12220,6 +12272,11 @@
     <w:p>
       <w:r>
         <w:t>Hệ thống được phát triển trên Windows, sử dụng Node.js 24.15.0 và npm. Frontend dùng React 18, React Router, Axios và Vite 5.4.21. Backend dùng Express theo chuẩn ES Modules. Dữ liệu được đặt trên Supabase PostgreSQL; extension pgvector lưu vector; Storage chứa file tài liệu. Gemini cung cấp model sinh nội dung và model embedding. Trình duyệt được dùng để kiểm thử tích hợp giao diện và API trên localhost.</w:t>
+      </w:r>
+    </w:p>
+    <w:p>
+      <w:r>
+        <w:t>Đặc biệt, phục vụ công tác đánh giá và nghiệm thu của Giảng viên hướng dẫn, ứng dụng đã được hoàn thiện đóng gói và phát hành chính thức trên nền tảng Vercel Cloud tại địa chỉ đường dẫn demo: https://study-ai-app-one.vercel.app/.</w:t>
       </w:r>
     </w:p>
     <w:p>
@@ -12340,7 +12397,7 @@
                 <w:b/>
                 <w:sz w:val="26"/>
               </w:rPr>
-              <w:t>Frontend</w:t>
+              <w:t>Đường dẫn Demo</w:t>
             </w:r>
           </w:p>
         </w:tc>
@@ -12364,7 +12421,7 @@
                 <w:b/>
                 <w:sz w:val="26"/>
               </w:rPr>
-              <w:t>React 18, Vite 5.4.21, React Router, Axios</w:t>
+              <w:t>https://study-ai-app-one.vercel.app/</w:t>
             </w:r>
           </w:p>
         </w:tc>
@@ -12396,7 +12453,7 @@
                 <w:b/>
                 <w:sz w:val="26"/>
               </w:rPr>
-              <w:t>Backend</w:t>
+              <w:t>Frontend</w:t>
             </w:r>
           </w:p>
         </w:tc>
@@ -12420,7 +12477,7 @@
                 <w:b/>
                 <w:sz w:val="26"/>
               </w:rPr>
-              <w:t>Node.js 24.15.0, Express, JavaScript ES Modules</w:t>
+              <w:t>React 18, Vite 5.4.21, React Router, Axios (Nền tảng Vercel)</w:t>
             </w:r>
           </w:p>
         </w:tc>
@@ -12452,7 +12509,7 @@
                 <w:b/>
                 <w:sz w:val="26"/>
               </w:rPr>
-              <w:t>Cơ sở dữ liệu</w:t>
+              <w:t>Backend</w:t>
             </w:r>
           </w:p>
         </w:tc>
@@ -12476,7 +12533,7 @@
                 <w:b/>
                 <w:sz w:val="26"/>
               </w:rPr>
-              <w:t>Supabase PostgreSQL, pgvector</w:t>
+              <w:t>Node.js 24.15.0, Express, JavaScript ES Modules</w:t>
             </w:r>
           </w:p>
         </w:tc>
@@ -12508,7 +12565,7 @@
                 <w:b/>
                 <w:sz w:val="26"/>
               </w:rPr>
-              <w:t>Lưu trữ</w:t>
+              <w:t>Cơ sở dữ liệu</w:t>
             </w:r>
           </w:p>
         </w:tc>
@@ -12532,7 +12589,7 @@
                 <w:b/>
                 <w:sz w:val="26"/>
               </w:rPr>
-              <w:t>Supabase Storage bucket private study-documents</w:t>
+              <w:t>Supabase PostgreSQL, pgvector</w:t>
             </w:r>
           </w:p>
         </w:tc>
@@ -12564,7 +12621,7 @@
                 <w:b/>
                 <w:sz w:val="26"/>
               </w:rPr>
-              <w:t>AI</w:t>
+              <w:t>Lưu trữ</w:t>
             </w:r>
           </w:p>
         </w:tc>
@@ -12588,7 +12645,7 @@
                 <w:b/>
                 <w:sz w:val="26"/>
               </w:rPr>
-              <w:t>Gemini generation và gemini-embedding-001, vector 768 chiều</w:t>
+              <w:t>Supabase Storage bucket private study-documents</w:t>
             </w:r>
           </w:p>
         </w:tc>
@@ -12620,6 +12677,62 @@
                 <w:b/>
                 <w:sz w:val="26"/>
               </w:rPr>
+              <w:t>AI</w:t>
+            </w:r>
+          </w:p>
+        </w:tc>
+        <w:tc>
+          <w:tcPr>
+            <w:tcW w:w="5669" w:type="dxa"/>
+            <w:shd w:val="clear" w:color="auto" w:fill="auto"/>
+          </w:tcPr>
+          <w:p>
+            <w:pPr>
+              <w:spacing w:after="60" w:line="240" w:lineRule="auto"/>
+              <w:ind w:firstLine="0"/>
+              <w:jc w:val="center"/>
+              <w:rPr>
+                <w:b/>
+                <w:sz w:val="26"/>
+              </w:rPr>
+            </w:pPr>
+            <w:r>
+              <w:rPr>
+                <w:b/>
+                <w:sz w:val="26"/>
+              </w:rPr>
+              <w:t>Gemini generation và gemini-embedding-001, vector 768 chiều</w:t>
+            </w:r>
+          </w:p>
+        </w:tc>
+      </w:tr>
+      <w:tr>
+        <w:tblPrEx>
+          <w:tblCellMar>
+            <w:top w:w="0" w:type="dxa"/>
+            <w:bottom w:w="0" w:type="dxa"/>
+          </w:tblCellMar>
+        </w:tblPrEx>
+        <w:tc>
+          <w:tcPr>
+            <w:tcW w:w="2551" w:type="dxa"/>
+            <w:shd w:val="clear" w:color="auto" w:fill="auto"/>
+          </w:tcPr>
+          <w:p>
+            <w:pPr>
+              <w:spacing w:after="60" w:line="240" w:lineRule="auto"/>
+              <w:ind w:firstLine="0"/>
+              <w:jc w:val="center"/>
+              <w:rPr>
+                <w:b/>
+                <w:sz w:val="26"/>
+              </w:rPr>
+            </w:pPr>
+            <w:r>
+              <w:rPr>
+                <w:b/>
+                <w:sz w:val="26"/>
+              </w:rPr>
               <w:t>Bảo mật</w:t>
             </w:r>
           </w:p>
@@ -12664,7 +12777,7 @@
       <w:pPr>
         <w:pStyle w:val="Heading2"/>
       </w:pPr>
-      <w:bookmarkStart w:id="55" w:name="_Toc235302314"/>
+      <w:bookmarkStart w:id="55" w:name="_Toc238244726"/>
       <w:r>
         <w:t>4.2. Triển khai các mô-đun</w:t>
       </w:r>
@@ -12674,7 +12787,7 @@
       <w:pPr>
         <w:pStyle w:val="Heading3"/>
       </w:pPr>
-      <w:bookmarkStart w:id="56" w:name="_Toc235302315"/>
+      <w:bookmarkStart w:id="56" w:name="_Toc238244727"/>
       <w:r>
         <w:t>4.2.1. Frontend</w:t>
       </w:r>
@@ -12682,14 +12795,18 @@
     </w:p>
     <w:p>
       <w:r>
-        <w:t>Frontend tổ chức theo trang và component dùng chung. Router phân tách đăng nhập, dashboard, môn học, nhiệm vụ, lịch, tài liệu và tìm kiếm. Axios interceptor gắn token vào request; tầng xử lý lỗi chuyển thông báo kỹ thuật thành phản hồi phù hợp. Các trang tài liệu hiển thị trạng thái lập chỉ mục, nút thử lại, phiên bản AI đang dùng và nguồn trích dẫn.</w:t>
+        <w:t xml:space="preserve">Frontend tổ chức theo trang và component dùng chung. Router phân tách đăng nhập, dashboard, môn học, nhiệm vụ, lịch, tài liệu và tìm kiếm. Axios interceptor gắn token vào request; tầng xử lý lỗi chuyển thông báo kỹ thuật </w:t>
+      </w:r>
+      <w:r>
+        <w:lastRenderedPageBreak/>
+        <w:t>thành phản hồi phù hợp. Các trang tài liệu hiển thị trạng thái lập chỉ mục, nút thử lại, phiên bản AI đang dùng và nguồn trích dẫn.</w:t>
       </w:r>
     </w:p>
     <w:p>
       <w:pPr>
         <w:pStyle w:val="Heading3"/>
       </w:pPr>
-      <w:bookmarkStart w:id="57" w:name="_Toc235302316"/>
+      <w:bookmarkStart w:id="57" w:name="_Toc238244728"/>
       <w:r>
         <w:t>4.2.2. Backend</w:t>
       </w:r>
@@ -12697,18 +12814,14 @@
     </w:p>
     <w:p>
       <w:r>
-        <w:t xml:space="preserve">Backend tổ chức route-controller-service-repository. Route định nghĩa endpoint và middleware; controller chuẩn hóa request/response; service thực thi nghiệp vụ; repository tương tác Supabase. Lớp AI đóng gói lời gọi Gemini </w:t>
-      </w:r>
-      <w:r>
-        <w:lastRenderedPageBreak/>
-        <w:t>và chế độ mock phục vụ kiểm thử. Cấu trúc này giúp thay đổi provider hoặc bổ sung queue mà không phải viết lại giao diện API.</w:t>
+        <w:t>Backend tổ chức route-controller-service-repository. Route định nghĩa endpoint và middleware; controller chuẩn hóa request/response; service thực thi nghiệp vụ; repository tương tác Supabase. Lớp AI đóng gói lời gọi Gemini và chế độ mock phục vụ kiểm thử. Cấu trúc này giúp thay đổi provider hoặc bổ sung queue mà không phải viết lại giao diện API.</w:t>
       </w:r>
     </w:p>
     <w:p>
       <w:pPr>
         <w:pStyle w:val="Heading3"/>
       </w:pPr>
-      <w:bookmarkStart w:id="58" w:name="_Toc235302317"/>
+      <w:bookmarkStart w:id="58" w:name="_Toc238244729"/>
       <w:r>
         <w:t>4.2.3. Cơ sở dữ liệu và Storage</w:t>
       </w:r>
@@ -12723,7 +12836,7 @@
       <w:pPr>
         <w:pStyle w:val="Heading2"/>
       </w:pPr>
-      <w:bookmarkStart w:id="59" w:name="_Toc235302318"/>
+      <w:bookmarkStart w:id="59" w:name="_Toc238244730"/>
       <w:r>
         <w:t>4.3. Kết quả giao diện</w:t>
       </w:r>
@@ -12739,7 +12852,7 @@
           <w:noProof/>
         </w:rPr>
         <w:drawing>
-          <wp:inline distT="0" distB="0" distL="0" distR="0" wp14:anchorId="2FAD0B16" wp14:editId="504D2BD3">
+          <wp:inline distT="0" distB="0" distL="0" distR="0" wp14:anchorId="5305E769" wp14:editId="3DF50B69">
             <wp:extent cx="5040000" cy="3499729"/>
             <wp:effectExtent l="0" t="0" r="8255" b="5715"/>
             <wp:docPr id="1" name="Picture 1"/>
@@ -12751,169 +12864,6 @@
                 <pic:pic xmlns:pic="http://schemas.openxmlformats.org/drawingml/2006/picture">
                   <pic:nvPicPr>
                     <pic:cNvPr id="1" name=""/>
-                    <pic:cNvPicPr/>
-                  </pic:nvPicPr>
-                  <pic:blipFill>
-                    <a:blip r:embed="rId14" cstate="print">
-                      <a:extLst>
-                        <a:ext uri="{28A0092B-C50C-407E-A947-70E740481C1C}">
-                          <a14:useLocalDpi xmlns:a14="http://schemas.microsoft.com/office/drawing/2010/main" val="0"/>
-                        </a:ext>
-                      </a:extLst>
-                    </a:blip>
-                    <a:stretch>
-                      <a:fillRect/>
-                    </a:stretch>
-                  </pic:blipFill>
-                  <pic:spPr>
-                    <a:xfrm>
-                      <a:off x="0" y="0"/>
-                      <a:ext cx="5040000" cy="3499729"/>
-                    </a:xfrm>
-                    <a:prstGeom prst="rect">
-                      <a:avLst/>
-                    </a:prstGeom>
-                  </pic:spPr>
-                </pic:pic>
-              </a:graphicData>
-            </a:graphic>
-          </wp:inline>
-        </w:drawing>
-      </w:r>
-    </w:p>
-    <w:p>
-      <w:pPr>
-        <w:ind w:firstLine="0"/>
-        <w:jc w:val="center"/>
-        <w:rPr>
-          <w:sz w:val="24"/>
-        </w:rPr>
-      </w:pPr>
-      <w:r>
-        <w:rPr>
-          <w:sz w:val="24"/>
-        </w:rPr>
-        <w:t>Hình 4.1. Giao diện đăng nhập StudyAI</w:t>
-      </w:r>
-    </w:p>
-    <w:p>
-      <w:pPr>
-        <w:ind w:firstLine="0"/>
-        <w:jc w:val="center"/>
-        <w:rPr>
-          <w:sz w:val="24"/>
-        </w:rPr>
-      </w:pPr>
-    </w:p>
-    <w:p>
-      <w:r>
-        <w:t>Trang đăng nhập yêu cầu email và mật khẩu, hiển thị lỗi rõ ràng và chỉ chuyển vào vùng ứng dụng sau khi backend phát token hợp lệ. Phiên đăng nhập được duy trì ở trình duyệt; khi API trả 401, dữ liệu phiên cũ được xóa để tránh trạng thái giao diện đã đăng nhập nhưng request tiếp tục thất bại.</w:t>
-      </w:r>
-    </w:p>
-    <w:p>
-      <w:pPr>
-        <w:ind w:firstLine="0"/>
-        <w:jc w:val="center"/>
-      </w:pPr>
-      <w:r>
-        <w:rPr>
-          <w:noProof/>
-        </w:rPr>
-        <w:lastRenderedPageBreak/>
-        <w:drawing>
-          <wp:inline distT="0" distB="0" distL="0" distR="0" wp14:anchorId="0158504B" wp14:editId="54C979A9">
-            <wp:extent cx="5040000" cy="3499729"/>
-            <wp:effectExtent l="0" t="0" r="8255" b="5715"/>
-            <wp:docPr id="2" name="Picture 2"/>
-            <wp:cNvGraphicFramePr>
-              <a:graphicFrameLocks xmlns:a="http://schemas.openxmlformats.org/drawingml/2006/main" noChangeAspect="1"/>
-            </wp:cNvGraphicFramePr>
-            <a:graphic xmlns:a="http://schemas.openxmlformats.org/drawingml/2006/main">
-              <a:graphicData uri="http://schemas.openxmlformats.org/drawingml/2006/picture">
-                <pic:pic xmlns:pic="http://schemas.openxmlformats.org/drawingml/2006/picture">
-                  <pic:nvPicPr>
-                    <pic:cNvPr id="2" name=""/>
-                    <pic:cNvPicPr/>
-                  </pic:nvPicPr>
-                  <pic:blipFill>
-                    <a:blip r:embed="rId15" cstate="print">
-                      <a:extLst>
-                        <a:ext uri="{28A0092B-C50C-407E-A947-70E740481C1C}">
-                          <a14:useLocalDpi xmlns:a14="http://schemas.microsoft.com/office/drawing/2010/main" val="0"/>
-                        </a:ext>
-                      </a:extLst>
-                    </a:blip>
-                    <a:stretch>
-                      <a:fillRect/>
-                    </a:stretch>
-                  </pic:blipFill>
-                  <pic:spPr>
-                    <a:xfrm>
-                      <a:off x="0" y="0"/>
-                      <a:ext cx="5040000" cy="3499729"/>
-                    </a:xfrm>
-                    <a:prstGeom prst="rect">
-                      <a:avLst/>
-                    </a:prstGeom>
-                  </pic:spPr>
-                </pic:pic>
-              </a:graphicData>
-            </a:graphic>
-          </wp:inline>
-        </w:drawing>
-      </w:r>
-    </w:p>
-    <w:p>
-      <w:pPr>
-        <w:ind w:firstLine="0"/>
-        <w:jc w:val="center"/>
-        <w:rPr>
-          <w:sz w:val="24"/>
-        </w:rPr>
-      </w:pPr>
-      <w:r>
-        <w:rPr>
-          <w:sz w:val="24"/>
-        </w:rPr>
-        <w:t>Hình 4.2. Giao diện upload và quản lý tài liệu</w:t>
-      </w:r>
-    </w:p>
-    <w:p>
-      <w:pPr>
-        <w:ind w:firstLine="0"/>
-        <w:jc w:val="center"/>
-        <w:rPr>
-          <w:sz w:val="24"/>
-        </w:rPr>
-      </w:pPr>
-    </w:p>
-    <w:p>
-      <w:r>
-        <w:t>Trang tài liệu cho phép chọn môn học, file và theo dõi trạng thái. Người dùng có thể nhận biết tài liệu chưa lập chỉ mục, đang xử lý, đã sẵn sàng hoặc thất bại. Thiết kế trạng thái giúp người dùng biết khi nào các chức năng RAG và tìm kiếm ngữ nghĩa có thể sử dụng.</w:t>
-      </w:r>
-    </w:p>
-    <w:p>
-      <w:pPr>
-        <w:ind w:firstLine="0"/>
-        <w:jc w:val="center"/>
-      </w:pPr>
-      <w:r>
-        <w:rPr>
-          <w:noProof/>
-        </w:rPr>
-        <w:drawing>
-          <wp:inline distT="0" distB="0" distL="0" distR="0" wp14:anchorId="5D718933" wp14:editId="32E34B38">
-            <wp:extent cx="5040000" cy="3499729"/>
-            <wp:effectExtent l="0" t="0" r="8255" b="5715"/>
-            <wp:docPr id="3" name="Picture 3"/>
-            <wp:cNvGraphicFramePr>
-              <a:graphicFrameLocks xmlns:a="http://schemas.openxmlformats.org/drawingml/2006/main" noChangeAspect="1"/>
-            </wp:cNvGraphicFramePr>
-            <a:graphic xmlns:a="http://schemas.openxmlformats.org/drawingml/2006/main">
-              <a:graphicData uri="http://schemas.openxmlformats.org/drawingml/2006/picture">
-                <pic:pic xmlns:pic="http://schemas.openxmlformats.org/drawingml/2006/picture">
-                  <pic:nvPicPr>
-                    <pic:cNvPr id="3" name=""/>
                     <pic:cNvPicPr/>
                   </pic:nvPicPr>
                   <pic:blipFill>
@@ -12956,8 +12906,7 @@
         <w:rPr>
           <w:sz w:val="24"/>
         </w:rPr>
-        <w:lastRenderedPageBreak/>
-        <w:t>Hình 4.3. Chi tiết tài liệu và các công cụ AI</w:t>
+        <w:t>Hình 4.1. Giao diện đăng nhập StudyAI</w:t>
       </w:r>
     </w:p>
     <w:p>
@@ -12971,7 +12920,8 @@
     </w:p>
     <w:p>
       <w:r>
-        <w:t>Tại trang chi tiết, người dùng tải file gốc qua signed URL, lập chỉ mục lại, tạo tóm tắt, flashcard, quiz và hỏi đáp. Trạng thái sẵn sàng được hiển thị cạnh tiêu đề. Các phiên bản AI được lưu để người dùng lựa chọn bản đang dùng thay vì mất kết quả cũ khi sinh lại.</w:t>
+        <w:lastRenderedPageBreak/>
+        <w:t>Trang đăng nhập yêu cầu email và mật khẩu, hiển thị lỗi rõ ràng và chỉ chuyển vào vùng ứng dụng sau khi backend phát token hợp lệ. Phiên đăng nhập được duy trì ở trình duyệt; khi API trả 401, dữ liệu phiên cũ được xóa để tránh trạng thái giao diện đã đăng nhập nhưng request tiếp tục thất bại.</w:t>
       </w:r>
     </w:p>
     <w:p>
@@ -12984,10 +12934,10 @@
           <w:noProof/>
         </w:rPr>
         <w:drawing>
-          <wp:inline distT="0" distB="0" distL="0" distR="0" wp14:anchorId="6C3D024C" wp14:editId="0D8498B7">
+          <wp:inline distT="0" distB="0" distL="0" distR="0" wp14:anchorId="32AD6381" wp14:editId="048002B8">
             <wp:extent cx="5040000" cy="3499729"/>
             <wp:effectExtent l="0" t="0" r="8255" b="5715"/>
-            <wp:docPr id="4" name="Picture 4"/>
+            <wp:docPr id="2" name="Picture 2"/>
             <wp:cNvGraphicFramePr>
               <a:graphicFrameLocks xmlns:a="http://schemas.openxmlformats.org/drawingml/2006/main" noChangeAspect="1"/>
             </wp:cNvGraphicFramePr>
@@ -12995,7 +12945,7 @@
               <a:graphicData uri="http://schemas.openxmlformats.org/drawingml/2006/picture">
                 <pic:pic xmlns:pic="http://schemas.openxmlformats.org/drawingml/2006/picture">
                   <pic:nvPicPr>
-                    <pic:cNvPr id="4" name=""/>
+                    <pic:cNvPr id="2" name=""/>
                     <pic:cNvPicPr/>
                   </pic:nvPicPr>
                   <pic:blipFill>
@@ -13038,7 +12988,7 @@
         <w:rPr>
           <w:sz w:val="24"/>
         </w:rPr>
-        <w:t>Hình 4.4. Giao diện tìm kiếm tài liệu</w:t>
+        <w:t>Hình 4.2. Giao diện upload và quản lý tài liệu</w:t>
       </w:r>
     </w:p>
     <w:p>
@@ -13052,6 +13002,170 @@
     </w:p>
     <w:p>
       <w:r>
+        <w:t>Trang tài liệu cho phép chọn môn học, file và theo dõi trạng thái. Người dùng có thể nhận biết tài liệu chưa lập chỉ mục, đang xử lý, đã sẵn sàng hoặc thất bại. Thiết kế trạng thái giúp người dùng biết khi nào các chức năng RAG và tìm kiếm ngữ nghĩa có thể sử dụng.</w:t>
+      </w:r>
+    </w:p>
+    <w:p>
+      <w:pPr>
+        <w:ind w:firstLine="0"/>
+        <w:jc w:val="center"/>
+      </w:pPr>
+      <w:r>
+        <w:rPr>
+          <w:noProof/>
+        </w:rPr>
+        <w:lastRenderedPageBreak/>
+        <w:drawing>
+          <wp:inline distT="0" distB="0" distL="0" distR="0" wp14:anchorId="6090FBD5" wp14:editId="7ABB74E2">
+            <wp:extent cx="5040000" cy="3499729"/>
+            <wp:effectExtent l="0" t="0" r="8255" b="5715"/>
+            <wp:docPr id="3" name="Picture 3"/>
+            <wp:cNvGraphicFramePr>
+              <a:graphicFrameLocks xmlns:a="http://schemas.openxmlformats.org/drawingml/2006/main" noChangeAspect="1"/>
+            </wp:cNvGraphicFramePr>
+            <a:graphic xmlns:a="http://schemas.openxmlformats.org/drawingml/2006/main">
+              <a:graphicData uri="http://schemas.openxmlformats.org/drawingml/2006/picture">
+                <pic:pic xmlns:pic="http://schemas.openxmlformats.org/drawingml/2006/picture">
+                  <pic:nvPicPr>
+                    <pic:cNvPr id="3" name=""/>
+                    <pic:cNvPicPr/>
+                  </pic:nvPicPr>
+                  <pic:blipFill>
+                    <a:blip r:embed="rId18" cstate="print">
+                      <a:extLst>
+                        <a:ext uri="{28A0092B-C50C-407E-A947-70E740481C1C}">
+                          <a14:useLocalDpi xmlns:a14="http://schemas.microsoft.com/office/drawing/2010/main" val="0"/>
+                        </a:ext>
+                      </a:extLst>
+                    </a:blip>
+                    <a:stretch>
+                      <a:fillRect/>
+                    </a:stretch>
+                  </pic:blipFill>
+                  <pic:spPr>
+                    <a:xfrm>
+                      <a:off x="0" y="0"/>
+                      <a:ext cx="5040000" cy="3499729"/>
+                    </a:xfrm>
+                    <a:prstGeom prst="rect">
+                      <a:avLst/>
+                    </a:prstGeom>
+                  </pic:spPr>
+                </pic:pic>
+              </a:graphicData>
+            </a:graphic>
+          </wp:inline>
+        </w:drawing>
+      </w:r>
+    </w:p>
+    <w:p>
+      <w:pPr>
+        <w:ind w:firstLine="0"/>
+        <w:jc w:val="center"/>
+        <w:rPr>
+          <w:sz w:val="24"/>
+        </w:rPr>
+      </w:pPr>
+      <w:r>
+        <w:rPr>
+          <w:sz w:val="24"/>
+        </w:rPr>
+        <w:t>Hình 4.3. Chi tiết tài liệu và các công cụ AI</w:t>
+      </w:r>
+    </w:p>
+    <w:p>
+      <w:pPr>
+        <w:ind w:firstLine="0"/>
+        <w:jc w:val="center"/>
+        <w:rPr>
+          <w:sz w:val="24"/>
+        </w:rPr>
+      </w:pPr>
+    </w:p>
+    <w:p>
+      <w:r>
+        <w:t>Tại trang chi tiết, người dùng tải file gốc qua signed URL, lập chỉ mục lại, tạo tóm tắt, flashcard, quiz và hỏi đáp. Trạng thái sẵn sàng được hiển thị cạnh tiêu đề. Các phiên bản AI được lưu để người dùng lựa chọn bản đang dùng thay vì mất kết quả cũ khi sinh lại.</w:t>
+      </w:r>
+    </w:p>
+    <w:p>
+      <w:pPr>
+        <w:ind w:firstLine="0"/>
+        <w:jc w:val="center"/>
+      </w:pPr>
+      <w:r>
+        <w:rPr>
+          <w:noProof/>
+        </w:rPr>
+        <w:drawing>
+          <wp:inline distT="0" distB="0" distL="0" distR="0" wp14:anchorId="1F2B6EE4" wp14:editId="31C2015F">
+            <wp:extent cx="5040000" cy="3499729"/>
+            <wp:effectExtent l="0" t="0" r="8255" b="5715"/>
+            <wp:docPr id="4" name="Picture 4"/>
+            <wp:cNvGraphicFramePr>
+              <a:graphicFrameLocks xmlns:a="http://schemas.openxmlformats.org/drawingml/2006/main" noChangeAspect="1"/>
+            </wp:cNvGraphicFramePr>
+            <a:graphic xmlns:a="http://schemas.openxmlformats.org/drawingml/2006/main">
+              <a:graphicData uri="http://schemas.openxmlformats.org/drawingml/2006/picture">
+                <pic:pic xmlns:pic="http://schemas.openxmlformats.org/drawingml/2006/picture">
+                  <pic:nvPicPr>
+                    <pic:cNvPr id="4" name=""/>
+                    <pic:cNvPicPr/>
+                  </pic:nvPicPr>
+                  <pic:blipFill>
+                    <a:blip r:embed="rId19" cstate="print">
+                      <a:extLst>
+                        <a:ext uri="{28A0092B-C50C-407E-A947-70E740481C1C}">
+                          <a14:useLocalDpi xmlns:a14="http://schemas.microsoft.com/office/drawing/2010/main" val="0"/>
+                        </a:ext>
+                      </a:extLst>
+                    </a:blip>
+                    <a:stretch>
+                      <a:fillRect/>
+                    </a:stretch>
+                  </pic:blipFill>
+                  <pic:spPr>
+                    <a:xfrm>
+                      <a:off x="0" y="0"/>
+                      <a:ext cx="5040000" cy="3499729"/>
+                    </a:xfrm>
+                    <a:prstGeom prst="rect">
+                      <a:avLst/>
+                    </a:prstGeom>
+                  </pic:spPr>
+                </pic:pic>
+              </a:graphicData>
+            </a:graphic>
+          </wp:inline>
+        </w:drawing>
+      </w:r>
+    </w:p>
+    <w:p>
+      <w:pPr>
+        <w:ind w:firstLine="0"/>
+        <w:jc w:val="center"/>
+        <w:rPr>
+          <w:sz w:val="24"/>
+        </w:rPr>
+      </w:pPr>
+      <w:r>
+        <w:rPr>
+          <w:sz w:val="24"/>
+        </w:rPr>
+        <w:lastRenderedPageBreak/>
+        <w:t>Hình 4.4. Giao diện tìm kiếm tài liệu</w:t>
+      </w:r>
+    </w:p>
+    <w:p>
+      <w:pPr>
+        <w:ind w:firstLine="0"/>
+        <w:jc w:val="center"/>
+        <w:rPr>
+          <w:sz w:val="24"/>
+        </w:rPr>
+      </w:pPr>
+    </w:p>
+    <w:p>
+      <w:r>
         <w:t>Màn hình tìm kiếm cung cấp các chế độ keyword, semantic và hybrid. Kết quả trả về kèm loại chế độ thực tế đã dùng; điều này đặc biệt hữu ích khi semantic gặp lỗi và backend chuyển sang keyword fallback.</w:t>
       </w:r>
     </w:p>
@@ -13059,7 +13173,7 @@
       <w:pPr>
         <w:pStyle w:val="Heading2"/>
       </w:pPr>
-      <w:bookmarkStart w:id="60" w:name="_Toc235302319"/>
+      <w:bookmarkStart w:id="60" w:name="_Toc238244731"/>
       <w:r>
         <w:t>4.4. Kiểm thử và kết quả</w:t>
       </w:r>
@@ -13069,7 +13183,7 @@
       <w:pPr>
         <w:pStyle w:val="Heading3"/>
       </w:pPr>
-      <w:bookmarkStart w:id="61" w:name="_Toc235302320"/>
+      <w:bookmarkStart w:id="61" w:name="_Toc238244732"/>
       <w:r>
         <w:t>4.4.1. Kiểm thử tự động backend</w:t>
       </w:r>
@@ -13077,11 +13191,7 @@
     </w:p>
     <w:p>
       <w:r>
-        <w:t xml:space="preserve">Bộ kiểm thử backend được chạy bằng npm test trong ngày 18/07/2026. Kết quả 6 trên 6 kiểm thử đạt, không có kiểm thử thất bại. Tổng thời gian thực </w:t>
-      </w:r>
-      <w:r>
-        <w:lastRenderedPageBreak/>
-        <w:t>thi xấp xỉ 280 ms. Các ca kiểm thử tập trung vào những quy tắc dễ gây sai lệch trong RAG và quiz.</w:t>
+        <w:t>Bộ kiểm thử backend được chạy bằng npm test trong ngày 18/07/2026. Kết quả 6 trên 6 kiểm thử đạt, không có kiểm thử thất bại. Tổng thời gian thực thi xấp xỉ 280 ms. Các ca kiểm thử tập trung vào những quy tắc dễ gây sai lệch trong RAG và quiz.</w:t>
       </w:r>
     </w:p>
     <w:p>
@@ -13695,7 +13805,7 @@
       <w:pPr>
         <w:pStyle w:val="Heading3"/>
       </w:pPr>
-      <w:bookmarkStart w:id="62" w:name="_Toc235302321"/>
+      <w:bookmarkStart w:id="62" w:name="_Toc238244733"/>
       <w:r>
         <w:t>4.4.2. Kiểm tra build frontend</w:t>
       </w:r>
@@ -13849,6 +13959,7 @@
                 <w:b/>
                 <w:sz w:val="26"/>
               </w:rPr>
+              <w:lastRenderedPageBreak/>
               <w:t>Số mô-đun</w:t>
             </w:r>
           </w:p>
@@ -14157,7 +14268,7 @@
       <w:pPr>
         <w:pStyle w:val="Heading3"/>
       </w:pPr>
-      <w:bookmarkStart w:id="63" w:name="_Toc235302322"/>
+      <w:bookmarkStart w:id="63" w:name="_Toc238244734"/>
       <w:r>
         <w:t>4.4.3. Kiểm thử luồng nghiệp vụ</w:t>
       </w:r>
@@ -14182,7 +14293,6 @@
           <w:b/>
           <w:sz w:val="26"/>
         </w:rPr>
-        <w:lastRenderedPageBreak/>
         <w:t>Bảng 4.4. Đánh giá các luồng chính</w:t>
       </w:r>
     </w:p>
@@ -14667,7 +14777,7 @@
       <w:pPr>
         <w:pStyle w:val="Heading2"/>
       </w:pPr>
-      <w:bookmarkStart w:id="64" w:name="_Toc235302323"/>
+      <w:bookmarkStart w:id="64" w:name="_Toc238244735"/>
       <w:r>
         <w:t>4.5. Đánh giá</w:t>
       </w:r>
@@ -14680,14 +14790,18 @@
     </w:p>
     <w:p>
       <w:r>
-        <w:t>Tuy nhiên, thử nghiệm hiện chủ yếu ở quy mô cá nhân và dữ liệu mẫu. Chất lượng tóm tắt, flashcard, quiz và truy xuất phụ thuộc chất lượng văn bản đầu vào, model Gemini, chiến lược chunk và ngưỡng tìm kiếm. Hệ thống chưa có bộ đánh giá RAG chuẩn hóa như precision@k, recall@k hay đánh giá mức độ bám nguồn; chưa đo tải đồng thời; và chưa xử lý OCR cho tài liệu quét.</w:t>
+        <w:t xml:space="preserve">Tuy nhiên, thử nghiệm hiện chủ yếu ở quy mô cá nhân và dữ liệu mẫu. Chất lượng tóm tắt, flashcard, quiz và truy xuất phụ thuộc chất lượng văn bản </w:t>
+      </w:r>
+      <w:r>
+        <w:lastRenderedPageBreak/>
+        <w:t>đầu vào, model Gemini, chiến lược chunk và ngưỡng tìm kiếm. Hệ thống chưa có bộ đánh giá RAG chuẩn hóa như precision@k, recall@k hay đánh giá mức độ bám nguồn; chưa đo tải đồng thời; và chưa xử lý OCR cho tài liệu quét.</w:t>
       </w:r>
     </w:p>
     <w:p>
       <w:pPr>
         <w:pStyle w:val="Heading2"/>
       </w:pPr>
-      <w:bookmarkStart w:id="65" w:name="_Toc235302324"/>
+      <w:bookmarkStart w:id="65" w:name="_Toc238244736"/>
       <w:r>
         <w:t>4.6. Tiểu kết Chương 4</w:t>
       </w:r>
@@ -14705,7 +14819,6 @@
         <w:jc w:val="left"/>
       </w:pPr>
       <w:r>
-        <w:lastRenderedPageBreak/>
         <w:br w:type="page"/>
       </w:r>
     </w:p>
@@ -14713,7 +14826,7 @@
       <w:pPr>
         <w:pStyle w:val="Heading1"/>
       </w:pPr>
-      <w:bookmarkStart w:id="66" w:name="_Toc235302325"/>
+      <w:bookmarkStart w:id="66" w:name="_Toc238244737"/>
       <w:r>
         <w:lastRenderedPageBreak/>
         <w:t>CHƯƠNG 5. KẾT LUẬN VÀ HƯỚNG PHÁT TRIỂN</w:t>
@@ -14724,7 +14837,7 @@
       <w:pPr>
         <w:pStyle w:val="Heading2"/>
       </w:pPr>
-      <w:bookmarkStart w:id="67" w:name="_Toc235302326"/>
+      <w:bookmarkStart w:id="67" w:name="_Toc238244738"/>
       <w:r>
         <w:t>5.1. Kết quả đạt được</w:t>
       </w:r>
@@ -14744,7 +14857,7 @@
       <w:pPr>
         <w:pStyle w:val="Heading2"/>
       </w:pPr>
-      <w:bookmarkStart w:id="68" w:name="_Toc235302327"/>
+      <w:bookmarkStart w:id="68" w:name="_Toc238244739"/>
       <w:r>
         <w:t>5.2. Hạn chế</w:t>
       </w:r>
@@ -14764,7 +14877,7 @@
       <w:pPr>
         <w:pStyle w:val="Heading2"/>
       </w:pPr>
-      <w:bookmarkStart w:id="69" w:name="_Toc235302328"/>
+      <w:bookmarkStart w:id="69" w:name="_Toc238244740"/>
       <w:r>
         <w:lastRenderedPageBreak/>
         <w:t>5.3. Hướng phát triển</w:t>
@@ -14790,7 +14903,7 @@
       <w:pPr>
         <w:pStyle w:val="Heading2"/>
       </w:pPr>
-      <w:bookmarkStart w:id="70" w:name="_Toc235302329"/>
+      <w:bookmarkStart w:id="70" w:name="_Toc238244741"/>
       <w:r>
         <w:t>5.4. Kết luận chung</w:t>
       </w:r>
@@ -14815,7 +14928,7 @@
       <w:pPr>
         <w:pStyle w:val="Heading1"/>
       </w:pPr>
-      <w:bookmarkStart w:id="71" w:name="_Toc235302330"/>
+      <w:bookmarkStart w:id="71" w:name="_Toc238244742"/>
       <w:r>
         <w:lastRenderedPageBreak/>
         <w:t>TÀI LIỆU THAM KHẢO</w:t>
@@ -14900,7 +15013,7 @@
       <w:pPr>
         <w:pStyle w:val="Heading1"/>
       </w:pPr>
-      <w:bookmarkStart w:id="72" w:name="_Toc235302331"/>
+      <w:bookmarkStart w:id="72" w:name="_Toc238244743"/>
       <w:r>
         <w:lastRenderedPageBreak/>
         <w:t>PHỤ LỤC</w:t>
@@ -14911,7 +15024,7 @@
       <w:pPr>
         <w:pStyle w:val="Heading2"/>
       </w:pPr>
-      <w:bookmarkStart w:id="73" w:name="_Toc235302332"/>
+      <w:bookmarkStart w:id="73" w:name="_Toc238244744"/>
       <w:r>
         <w:t>PHỤ LỤC A. CẤU TRÚC MÃ NGUỒN</w:t>
       </w:r>
@@ -15011,7 +15124,7 @@
       <w:pPr>
         <w:pStyle w:val="Heading2"/>
       </w:pPr>
-      <w:bookmarkStart w:id="74" w:name="_Toc235302333"/>
+      <w:bookmarkStart w:id="74" w:name="_Toc238244745"/>
       <w:r>
         <w:t>PHỤ LỤC B. CÁC BIẾN MÔI TRƯỜNG</w:t>
       </w:r>
@@ -15026,9 +15139,9 @@
       <w:pPr>
         <w:pStyle w:val="Heading2"/>
       </w:pPr>
-      <w:bookmarkStart w:id="75" w:name="_Toc235302334"/>
-      <w:r>
-        <w:t>PHỤ LỤC C. QUY TRÌNH KHỞI CHẠY</w:t>
+      <w:bookmarkStart w:id="75" w:name="_Toc238244746"/>
+      <w:r>
+        <w:t>PHỤ LỤC C. QUY TRÌNH KHỞI CHẠY VÀ TRẢI NGHIỆM DEMO</w:t>
       </w:r>
       <w:bookmarkEnd w:id="75"/>
     </w:p>
@@ -15037,14 +15150,16 @@
         <w:ind w:firstLine="0"/>
         <w:jc w:val="left"/>
         <w:rPr>
+          <w:b/>
           <w:sz w:val="26"/>
         </w:rPr>
       </w:pPr>
       <w:r>
         <w:rPr>
+          <w:b/>
           <w:sz w:val="26"/>
         </w:rPr>
-        <w:t>1. Backup cơ sở dữ liệu và chạy migration trong Supabase SQL Editor.</w:t>
+        <w:t>1. Đường dẫn trải nghiệm trực tuyến (Demo cho Giảng viên):</w:t>
       </w:r>
     </w:p>
     <w:p>
@@ -15059,7 +15174,7 @@
         <w:rPr>
           <w:sz w:val="26"/>
         </w:rPr>
-        <w:t>2. Xác nhận bucket study-documents ở chế độ private.</w:t>
+        <w:t xml:space="preserve">   https://study-ai-app-one.vercel.app/</w:t>
       </w:r>
     </w:p>
     <w:p>
@@ -15067,14 +15182,16 @@
         <w:ind w:firstLine="0"/>
         <w:jc w:val="left"/>
         <w:rPr>
+          <w:b/>
           <w:sz w:val="26"/>
         </w:rPr>
       </w:pPr>
       <w:r>
         <w:rPr>
+          <w:b/>
           <w:sz w:val="26"/>
         </w:rPr>
-        <w:t>3. Cập nhật backend/.env bằng khóa hợp lệ; không commit file này.</w:t>
+        <w:t>2. Quy trình khởi chạy môi trường thử nghiệm cục bộ (Local):</w:t>
       </w:r>
     </w:p>
     <w:p>
@@ -15089,7 +15206,7 @@
         <w:rPr>
           <w:sz w:val="26"/>
         </w:rPr>
-        <w:t>4. Tại backend chạy npm install, npm run dev; tại frontend chạy npm install, npm run dev.</w:t>
+        <w:t xml:space="preserve">   a. Backup cơ sở dữ liệu và chạy migration trong Supabase SQL Editor.</w:t>
       </w:r>
     </w:p>
     <w:p>
@@ -15104,7 +15221,7 @@
         <w:rPr>
           <w:sz w:val="26"/>
         </w:rPr>
-        <w:t>5. Nếu chuyển file local cũ, chạy npm run migrate:storage trong backend.</w:t>
+        <w:t xml:space="preserve">   b. Xác nhận bucket study-documents ở chế độ private.</w:t>
       </w:r>
     </w:p>
     <w:p>
@@ -15119,7 +15236,53 @@
         <w:rPr>
           <w:sz w:val="26"/>
         </w:rPr>
-        <w:t>6. Đăng nhập và dùng nút Lập chỉ mục lại cho tài liệu cũ.</w:t>
+        <w:t xml:space="preserve">   c. Cập nhật backend/.env bằng khóa hợp lệ; không commit file này.</w:t>
+      </w:r>
+    </w:p>
+    <w:p>
+      <w:pPr>
+        <w:ind w:firstLine="0"/>
+        <w:jc w:val="left"/>
+        <w:rPr>
+          <w:sz w:val="26"/>
+        </w:rPr>
+      </w:pPr>
+      <w:r>
+        <w:rPr>
+          <w:sz w:val="26"/>
+        </w:rPr>
+        <w:t xml:space="preserve">   d. Tại backend chạy npm install, npm run dev; tại frontend chạy npm install, npm run dev.</w:t>
+      </w:r>
+    </w:p>
+    <w:p>
+      <w:pPr>
+        <w:ind w:firstLine="0"/>
+        <w:jc w:val="left"/>
+        <w:rPr>
+          <w:sz w:val="26"/>
+        </w:rPr>
+      </w:pPr>
+      <w:r>
+        <w:rPr>
+          <w:sz w:val="26"/>
+        </w:rPr>
+        <w:t xml:space="preserve">   e. Nếu chuyển file local cũ, chạy npm run migrate:storage trong backend.</w:t>
+      </w:r>
+    </w:p>
+    <w:p>
+      <w:pPr>
+        <w:ind w:firstLine="0"/>
+        <w:jc w:val="left"/>
+        <w:rPr>
+          <w:sz w:val="26"/>
+        </w:rPr>
+      </w:pPr>
+      <w:r>
+        <w:rPr>
+          <w:sz w:val="26"/>
+        </w:rPr>
+        <w:lastRenderedPageBreak/>
+        <w:t xml:space="preserve">   f. Đăng nhập và dùng nút Lập chỉ mục lại cho tài liệu cũ.</w:t>
       </w:r>
     </w:p>
     <w:p>
@@ -15148,8 +15311,8 @@
       </w:pPr>
     </w:p>
     <w:sectPr>
-      <w:headerReference w:type="default" r:id="rId18"/>
-      <w:footerReference w:type="default" r:id="rId19"/>
+      <w:headerReference w:type="default" r:id="rId20"/>
+      <w:footerReference w:type="default" r:id="rId21"/>
       <w:pgSz w:w="11907" w:h="16839"/>
       <w:pgMar w:top="1134" w:right="1134" w:bottom="1134" w:left="1984" w:header="720" w:footer="720" w:gutter="0"/>
       <w:pgNumType w:start="1"/>
@@ -15247,6 +15410,16 @@
   <w:p>
     <w:pPr>
       <w:pStyle w:val="Footer"/>
+    </w:pPr>
+  </w:p>
+</w:ftr>
+</file>
+
+<file path=word/footer5.xml><?xml version="1.0" encoding="utf-8"?>
+<w:ftr xmlns:wpc="http://schemas.microsoft.com/office/word/2010/wordprocessingCanvas" xmlns:cx="http://schemas.microsoft.com/office/drawing/2014/chartex" xmlns:cx1="http://schemas.microsoft.com/office/drawing/2015/9/8/chartex" xmlns:cx2="http://schemas.microsoft.com/office/drawing/2015/10/21/chartex" xmlns:cx3="http://schemas.microsoft.com/office/drawing/2016/5/9/chartex" xmlns:cx4="http://schemas.microsoft.com/office/drawing/2016/5/10/chartex" xmlns:cx5="http://schemas.microsoft.com/office/drawing/2016/5/11/chartex" xmlns:cx6="http://schemas.microsoft.com/office/drawing/2016/5/12/chartex" xmlns:cx7="http://schemas.microsoft.com/office/drawing/2016/5/13/chartex" xmlns:cx8="http://schemas.microsoft.com/office/drawing/2016/5/14/chartex" xmlns:mc="http://schemas.openxmlformats.org/markup-compatibility/2006" xmlns:aink="http://schemas.microsoft.com/office/drawing/2016/ink" xmlns:am3d="http://schemas.microsoft.com/office/drawing/2017/model3d" xmlns:o="urn:schemas-microsoft-com:office:office" xmlns:oel="http://schemas.microsoft.com/office/2019/extlst" xmlns:r="http://schemas.openxmlformats.org/officeDocument/2006/relationships" xmlns:m="http://schemas.openxmlformats.org/officeDocument/2006/math" xmlns:v="urn:schemas-microsoft-com:vml" xmlns:wp14="http://schemas.microsoft.com/office/word/2010/wordprocessingDrawing" xmlns:wp="http://schemas.openxmlformats.org/drawingml/2006/wordprocessingDrawing" xmlns:w10="urn:schemas-microsoft-com:office:word" xmlns:w="http://schemas.openxmlformats.org/wordprocessingml/2006/main" xmlns:w14="http://schemas.microsoft.com/office/word/2010/wordml" xmlns:w15="http://schemas.microsoft.com/office/word/2012/wordml" xmlns:w16cex="http://schemas.microsoft.com/office/word/2018/wordml/cex" xmlns:w16cid="http://schemas.microsoft.com/office/word/2016/wordml/cid" xmlns:w16="http://schemas.microsoft.com/office/word/2018/wordml" xmlns:w16sdtdh="http://schemas.microsoft.com/office/word/2020/wordml/sdtdatahash" xmlns:w16se="http://schemas.microsoft.com/office/word/2015/wordml/symex" xmlns:wpg="http://schemas.microsoft.com/office/word/2010/wordprocessingGroup" xmlns:wpi="http://schemas.microsoft.com/office/word/2010/wordprocessingInk" xmlns:wne="http://schemas.microsoft.com/office/word/2006/wordml" xmlns:wps="http://schemas.microsoft.com/office/word/2010/wordprocessingShape" mc:Ignorable="w14 w15 w16se w16cid w16 w16cex w16sdtdh wp14">
+  <w:p>
+    <w:pPr>
+      <w:pStyle w:val="Footer"/>
       <w:framePr w:wrap="around" w:vAnchor="text" w:hAnchor="margin" w:xAlign="center" w:y="1"/>
       <w:rPr>
         <w:rStyle w:val="PageNumber"/>
@@ -15302,7 +15475,7 @@
 </w:ftr>
 </file>
 
-<file path=word/footer5.xml><?xml version="1.0" encoding="utf-8"?>
+<file path=word/footer6.xml><?xml version="1.0" encoding="utf-8"?>
 <w:ftr xmlns:wpc="http://schemas.microsoft.com/office/word/2010/wordprocessingCanvas" xmlns:cx="http://schemas.microsoft.com/office/drawing/2014/chartex" xmlns:cx1="http://schemas.microsoft.com/office/drawing/2015/9/8/chartex" xmlns:cx2="http://schemas.microsoft.com/office/drawing/2015/10/21/chartex" xmlns:cx3="http://schemas.microsoft.com/office/drawing/2016/5/9/chartex" xmlns:cx4="http://schemas.microsoft.com/office/drawing/2016/5/10/chartex" xmlns:cx5="http://schemas.microsoft.com/office/drawing/2016/5/11/chartex" xmlns:cx6="http://schemas.microsoft.com/office/drawing/2016/5/12/chartex" xmlns:cx7="http://schemas.microsoft.com/office/drawing/2016/5/13/chartex" xmlns:cx8="http://schemas.microsoft.com/office/drawing/2016/5/14/chartex" xmlns:mc="http://schemas.openxmlformats.org/markup-compatibility/2006" xmlns:aink="http://schemas.microsoft.com/office/drawing/2016/ink" xmlns:am3d="http://schemas.microsoft.com/office/drawing/2017/model3d" xmlns:o="urn:schemas-microsoft-com:office:office" xmlns:oel="http://schemas.microsoft.com/office/2019/extlst" xmlns:r="http://schemas.openxmlformats.org/officeDocument/2006/relationships" xmlns:m="http://schemas.openxmlformats.org/officeDocument/2006/math" xmlns:v="urn:schemas-microsoft-com:vml" xmlns:wp14="http://schemas.microsoft.com/office/word/2010/wordprocessingDrawing" xmlns:wp="http://schemas.openxmlformats.org/drawingml/2006/wordprocessingDrawing" xmlns:w10="urn:schemas-microsoft-com:office:word" xmlns:w="http://schemas.openxmlformats.org/wordprocessingml/2006/main" xmlns:w14="http://schemas.microsoft.com/office/word/2010/wordml" xmlns:w15="http://schemas.microsoft.com/office/word/2012/wordml" xmlns:w16cex="http://schemas.microsoft.com/office/word/2018/wordml/cex" xmlns:w16cid="http://schemas.microsoft.com/office/word/2016/wordml/cid" xmlns:w16="http://schemas.microsoft.com/office/word/2018/wordml" xmlns:w16sdtdh="http://schemas.microsoft.com/office/word/2020/wordml/sdtdatahash" xmlns:w16se="http://schemas.microsoft.com/office/word/2015/wordml/symex" xmlns:wpg="http://schemas.microsoft.com/office/word/2010/wordprocessingGroup" xmlns:wpi="http://schemas.microsoft.com/office/word/2010/wordprocessingInk" xmlns:wne="http://schemas.microsoft.com/office/word/2006/wordml" xmlns:wps="http://schemas.microsoft.com/office/word/2010/wordprocessingShape" mc:Ignorable="w14 w15 w16se w16cid w16 w16cex w16sdtdh wp14">
   <w:p>
     <w:pPr>
@@ -15428,6 +15601,16 @@
 </file>
 
 <file path=word/header5.xml><?xml version="1.0" encoding="utf-8"?>
+<w:hdr xmlns:wpc="http://schemas.microsoft.com/office/word/2010/wordprocessingCanvas" xmlns:cx="http://schemas.microsoft.com/office/drawing/2014/chartex" xmlns:cx1="http://schemas.microsoft.com/office/drawing/2015/9/8/chartex" xmlns:cx2="http://schemas.microsoft.com/office/drawing/2015/10/21/chartex" xmlns:cx3="http://schemas.microsoft.com/office/drawing/2016/5/9/chartex" xmlns:cx4="http://schemas.microsoft.com/office/drawing/2016/5/10/chartex" xmlns:cx5="http://schemas.microsoft.com/office/drawing/2016/5/11/chartex" xmlns:cx6="http://schemas.microsoft.com/office/drawing/2016/5/12/chartex" xmlns:cx7="http://schemas.microsoft.com/office/drawing/2016/5/13/chartex" xmlns:cx8="http://schemas.microsoft.com/office/drawing/2016/5/14/chartex" xmlns:mc="http://schemas.openxmlformats.org/markup-compatibility/2006" xmlns:aink="http://schemas.microsoft.com/office/drawing/2016/ink" xmlns:am3d="http://schemas.microsoft.com/office/drawing/2017/model3d" xmlns:o="urn:schemas-microsoft-com:office:office" xmlns:oel="http://schemas.microsoft.com/office/2019/extlst" xmlns:r="http://schemas.openxmlformats.org/officeDocument/2006/relationships" xmlns:m="http://schemas.openxmlformats.org/officeDocument/2006/math" xmlns:v="urn:schemas-microsoft-com:vml" xmlns:wp14="http://schemas.microsoft.com/office/word/2010/wordprocessingDrawing" xmlns:wp="http://schemas.openxmlformats.org/drawingml/2006/wordprocessingDrawing" xmlns:w10="urn:schemas-microsoft-com:office:word" xmlns:w="http://schemas.openxmlformats.org/wordprocessingml/2006/main" xmlns:w14="http://schemas.microsoft.com/office/word/2010/wordml" xmlns:w15="http://schemas.microsoft.com/office/word/2012/wordml" xmlns:w16cex="http://schemas.microsoft.com/office/word/2018/wordml/cex" xmlns:w16cid="http://schemas.microsoft.com/office/word/2016/wordml/cid" xmlns:w16="http://schemas.microsoft.com/office/word/2018/wordml" xmlns:w16sdtdh="http://schemas.microsoft.com/office/word/2020/wordml/sdtdatahash" xmlns:w16se="http://schemas.microsoft.com/office/word/2015/wordml/symex" xmlns:wpg="http://schemas.microsoft.com/office/word/2010/wordprocessingGroup" xmlns:wpi="http://schemas.microsoft.com/office/word/2010/wordprocessingInk" xmlns:wne="http://schemas.microsoft.com/office/word/2006/wordml" xmlns:wps="http://schemas.microsoft.com/office/word/2010/wordprocessingShape" mc:Ignorable="w14 w15 w16se w16cid w16 w16cex w16sdtdh wp14">
+  <w:p>
+    <w:pPr>
+      <w:pStyle w:val="Header"/>
+    </w:pPr>
+  </w:p>
+</w:hdr>
+</file>
+
+<file path=word/header6.xml><?xml version="1.0" encoding="utf-8"?>
 <w:hdr xmlns:wpc="http://schemas.microsoft.com/office/word/2010/wordprocessingCanvas" xmlns:cx="http://schemas.microsoft.com/office/drawing/2014/chartex" xmlns:cx1="http://schemas.microsoft.com/office/drawing/2015/9/8/chartex" xmlns:cx2="http://schemas.microsoft.com/office/drawing/2015/10/21/chartex" xmlns:cx3="http://schemas.microsoft.com/office/drawing/2016/5/9/chartex" xmlns:cx4="http://schemas.microsoft.com/office/drawing/2016/5/10/chartex" xmlns:cx5="http://schemas.microsoft.com/office/drawing/2016/5/11/chartex" xmlns:cx6="http://schemas.microsoft.com/office/drawing/2016/5/12/chartex" xmlns:cx7="http://schemas.microsoft.com/office/drawing/2016/5/13/chartex" xmlns:cx8="http://schemas.microsoft.com/office/drawing/2016/5/14/chartex" xmlns:mc="http://schemas.openxmlformats.org/markup-compatibility/2006" xmlns:aink="http://schemas.microsoft.com/office/drawing/2016/ink" xmlns:am3d="http://schemas.microsoft.com/office/drawing/2017/model3d" xmlns:o="urn:schemas-microsoft-com:office:office" xmlns:oel="http://schemas.microsoft.com/office/2019/extlst" xmlns:r="http://schemas.openxmlformats.org/officeDocument/2006/relationships" xmlns:m="http://schemas.openxmlformats.org/officeDocument/2006/math" xmlns:v="urn:schemas-microsoft-com:vml" xmlns:wp14="http://schemas.microsoft.com/office/word/2010/wordprocessingDrawing" xmlns:wp="http://schemas.openxmlformats.org/drawingml/2006/wordprocessingDrawing" xmlns:w10="urn:schemas-microsoft-com:office:word" xmlns:w="http://schemas.openxmlformats.org/wordprocessingml/2006/main" xmlns:w14="http://schemas.microsoft.com/office/word/2010/wordml" xmlns:w15="http://schemas.microsoft.com/office/word/2012/wordml" xmlns:w16cex="http://schemas.microsoft.com/office/word/2018/wordml/cex" xmlns:w16cid="http://schemas.microsoft.com/office/word/2016/wordml/cid" xmlns:w16="http://schemas.microsoft.com/office/word/2018/wordml" xmlns:w16sdtdh="http://schemas.microsoft.com/office/word/2020/wordml/sdtdatahash" xmlns:w16se="http://schemas.microsoft.com/office/word/2015/wordml/symex" xmlns:wpg="http://schemas.microsoft.com/office/word/2010/wordprocessingGroup" xmlns:wpi="http://schemas.microsoft.com/office/word/2010/wordprocessingInk" xmlns:wne="http://schemas.microsoft.com/office/word/2006/wordml" xmlns:wps="http://schemas.microsoft.com/office/word/2010/wordprocessingShape" mc:Ignorable="w14 w15 w16se w16cid w16 w16cex w16sdtdh wp14">
   <w:p>
     <w:pPr>
@@ -15854,7 +16037,7 @@
     <w:link w:val="Heading1Char"/>
     <w:uiPriority w:val="9"/>
     <w:qFormat/>
-    <w:rsid w:val="006B332D"/>
+    <w:rsid w:val="009D5B8E"/>
     <w:pPr>
       <w:keepNext/>
       <w:keepLines/>
@@ -15879,7 +16062,7 @@
     <w:uiPriority w:val="9"/>
     <w:unhideWhenUsed/>
     <w:qFormat/>
-    <w:rsid w:val="006B332D"/>
+    <w:rsid w:val="009D5B8E"/>
     <w:pPr>
       <w:keepNext/>
       <w:keepLines/>
@@ -15903,7 +16086,7 @@
     <w:uiPriority w:val="9"/>
     <w:unhideWhenUsed/>
     <w:qFormat/>
-    <w:rsid w:val="006B332D"/>
+    <w:rsid w:val="009D5B8E"/>
     <w:pPr>
       <w:keepNext/>
       <w:keepLines/>
@@ -15929,7 +16112,7 @@
     <w:semiHidden/>
     <w:unhideWhenUsed/>
     <w:qFormat/>
-    <w:rsid w:val="006B332D"/>
+    <w:rsid w:val="009D5B8E"/>
     <w:pPr>
       <w:keepNext/>
       <w:keepLines/>
@@ -15952,7 +16135,7 @@
     <w:semiHidden/>
     <w:unhideWhenUsed/>
     <w:qFormat/>
-    <w:rsid w:val="006B332D"/>
+    <w:rsid w:val="009D5B8E"/>
     <w:pPr>
       <w:keepNext/>
       <w:keepLines/>
@@ -15973,7 +16156,7 @@
     <w:semiHidden/>
     <w:unhideWhenUsed/>
     <w:qFormat/>
-    <w:rsid w:val="006B332D"/>
+    <w:rsid w:val="009D5B8E"/>
     <w:pPr>
       <w:keepNext/>
       <w:keepLines/>
@@ -15996,7 +16179,7 @@
     <w:semiHidden/>
     <w:unhideWhenUsed/>
     <w:qFormat/>
-    <w:rsid w:val="006B332D"/>
+    <w:rsid w:val="009D5B8E"/>
     <w:pPr>
       <w:keepNext/>
       <w:keepLines/>
@@ -16017,7 +16200,7 @@
     <w:semiHidden/>
     <w:unhideWhenUsed/>
     <w:qFormat/>
-    <w:rsid w:val="006B332D"/>
+    <w:rsid w:val="009D5B8E"/>
     <w:pPr>
       <w:keepNext/>
       <w:keepLines/>
@@ -16040,7 +16223,7 @@
     <w:semiHidden/>
     <w:unhideWhenUsed/>
     <w:qFormat/>
-    <w:rsid w:val="006B332D"/>
+    <w:rsid w:val="009D5B8E"/>
     <w:pPr>
       <w:keepNext/>
       <w:keepLines/>
@@ -16084,7 +16267,7 @@
     <w:basedOn w:val="DefaultParagraphFont"/>
     <w:link w:val="Heading1"/>
     <w:uiPriority w:val="9"/>
-    <w:rsid w:val="006B332D"/>
+    <w:rsid w:val="009D5B8E"/>
     <w:rPr>
       <w:rFonts w:ascii="Times New Roman" w:eastAsiaTheme="majorEastAsia" w:hAnsi="Times New Roman" w:cs="Times New Roman"/>
       <w:b/>
@@ -16098,7 +16281,7 @@
     <w:basedOn w:val="DefaultParagraphFont"/>
     <w:link w:val="Heading2"/>
     <w:uiPriority w:val="9"/>
-    <w:rsid w:val="006B332D"/>
+    <w:rsid w:val="009D5B8E"/>
     <w:rPr>
       <w:rFonts w:ascii="Times New Roman" w:eastAsiaTheme="majorEastAsia" w:hAnsi="Times New Roman" w:cs="Times New Roman"/>
       <w:b/>
@@ -16112,7 +16295,7 @@
     <w:basedOn w:val="DefaultParagraphFont"/>
     <w:link w:val="Heading3"/>
     <w:uiPriority w:val="9"/>
-    <w:rsid w:val="006B332D"/>
+    <w:rsid w:val="009D5B8E"/>
     <w:rPr>
       <w:rFonts w:ascii="Times New Roman" w:eastAsiaTheme="majorEastAsia" w:hAnsi="Times New Roman" w:cs="Times New Roman"/>
       <w:b/>
@@ -16128,7 +16311,7 @@
     <w:link w:val="Heading4"/>
     <w:uiPriority w:val="9"/>
     <w:semiHidden/>
-    <w:rsid w:val="006B332D"/>
+    <w:rsid w:val="009D5B8E"/>
     <w:rPr>
       <w:rFonts w:eastAsiaTheme="majorEastAsia" w:cstheme="majorBidi"/>
       <w:i/>
@@ -16142,7 +16325,7 @@
     <w:link w:val="Heading5"/>
     <w:uiPriority w:val="9"/>
     <w:semiHidden/>
-    <w:rsid w:val="006B332D"/>
+    <w:rsid w:val="009D5B8E"/>
     <w:rPr>
       <w:rFonts w:eastAsiaTheme="majorEastAsia" w:cstheme="majorBidi"/>
       <w:color w:val="0F4761" w:themeColor="accent1" w:themeShade="BF"/>
@@ -16154,7 +16337,7 @@
     <w:link w:val="Heading6"/>
     <w:uiPriority w:val="9"/>
     <w:semiHidden/>
-    <w:rsid w:val="006B332D"/>
+    <w:rsid w:val="009D5B8E"/>
     <w:rPr>
       <w:rFonts w:eastAsiaTheme="majorEastAsia" w:cstheme="majorBidi"/>
       <w:i/>
@@ -16168,7 +16351,7 @@
     <w:link w:val="Heading7"/>
     <w:uiPriority w:val="9"/>
     <w:semiHidden/>
-    <w:rsid w:val="006B332D"/>
+    <w:rsid w:val="009D5B8E"/>
     <w:rPr>
       <w:rFonts w:eastAsiaTheme="majorEastAsia" w:cstheme="majorBidi"/>
       <w:color w:val="595959" w:themeColor="text1" w:themeTint="A6"/>
@@ -16180,7 +16363,7 @@
     <w:link w:val="Heading8"/>
     <w:uiPriority w:val="9"/>
     <w:semiHidden/>
-    <w:rsid w:val="006B332D"/>
+    <w:rsid w:val="009D5B8E"/>
     <w:rPr>
       <w:rFonts w:eastAsiaTheme="majorEastAsia" w:cstheme="majorBidi"/>
       <w:i/>
@@ -16194,7 +16377,7 @@
     <w:link w:val="Heading9"/>
     <w:uiPriority w:val="9"/>
     <w:semiHidden/>
-    <w:rsid w:val="006B332D"/>
+    <w:rsid w:val="009D5B8E"/>
     <w:rPr>
       <w:rFonts w:eastAsiaTheme="majorEastAsia" w:cstheme="majorBidi"/>
       <w:color w:val="272727" w:themeColor="text1" w:themeTint="D8"/>
@@ -16207,7 +16390,7 @@
     <w:link w:val="TitleChar"/>
     <w:uiPriority w:val="10"/>
     <w:qFormat/>
-    <w:rsid w:val="006B332D"/>
+    <w:rsid w:val="009D5B8E"/>
     <w:pPr>
       <w:spacing w:after="80" w:line="240" w:lineRule="auto"/>
       <w:contextualSpacing/>
@@ -16225,7 +16408,7 @@
     <w:basedOn w:val="DefaultParagraphFont"/>
     <w:link w:val="Title"/>
     <w:uiPriority w:val="10"/>
-    <w:rsid w:val="006B332D"/>
+    <w:rsid w:val="009D5B8E"/>
     <w:rPr>
       <w:rFonts w:asciiTheme="majorHAnsi" w:eastAsiaTheme="majorEastAsia" w:hAnsiTheme="majorHAnsi" w:cstheme="majorBidi"/>
       <w:spacing w:val="-10"/>
@@ -16241,7 +16424,7 @@
     <w:link w:val="SubtitleChar"/>
     <w:uiPriority w:val="11"/>
     <w:qFormat/>
-    <w:rsid w:val="006B332D"/>
+    <w:rsid w:val="009D5B8E"/>
     <w:pPr>
       <w:numPr>
         <w:ilvl w:val="1"/>
@@ -16259,7 +16442,7 @@
     <w:basedOn w:val="DefaultParagraphFont"/>
     <w:link w:val="Subtitle"/>
     <w:uiPriority w:val="11"/>
-    <w:rsid w:val="006B332D"/>
+    <w:rsid w:val="009D5B8E"/>
     <w:rPr>
       <w:rFonts w:eastAsiaTheme="majorEastAsia" w:cstheme="majorBidi"/>
       <w:color w:val="595959" w:themeColor="text1" w:themeTint="A6"/>
@@ -16275,7 +16458,7 @@
     <w:link w:val="QuoteChar"/>
     <w:uiPriority w:val="29"/>
     <w:qFormat/>
-    <w:rsid w:val="006B332D"/>
+    <w:rsid w:val="009D5B8E"/>
     <w:pPr>
       <w:spacing w:before="160"/>
       <w:jc w:val="center"/>
@@ -16291,7 +16474,7 @@
     <w:basedOn w:val="DefaultParagraphFont"/>
     <w:link w:val="Quote"/>
     <w:uiPriority w:val="29"/>
-    <w:rsid w:val="006B332D"/>
+    <w:rsid w:val="009D5B8E"/>
     <w:rPr>
       <w:i/>
       <w:iCs/>
@@ -16303,7 +16486,7 @@
     <w:basedOn w:val="Normal"/>
     <w:uiPriority w:val="34"/>
     <w:qFormat/>
-    <w:rsid w:val="006B332D"/>
+    <w:rsid w:val="009D5B8E"/>
     <w:pPr>
       <w:ind w:left="720"/>
       <w:contextualSpacing/>
@@ -16314,7 +16497,7 @@
     <w:basedOn w:val="DefaultParagraphFont"/>
     <w:uiPriority w:val="21"/>
     <w:qFormat/>
-    <w:rsid w:val="006B332D"/>
+    <w:rsid w:val="009D5B8E"/>
     <w:rPr>
       <w:i/>
       <w:iCs/>
@@ -16328,7 +16511,7 @@
     <w:link w:val="IntenseQuoteChar"/>
     <w:uiPriority w:val="30"/>
     <w:qFormat/>
-    <w:rsid w:val="006B332D"/>
+    <w:rsid w:val="009D5B8E"/>
     <w:pPr>
       <w:pBdr>
         <w:top w:val="single" w:sz="4" w:space="10" w:color="0F4761" w:themeColor="accent1" w:themeShade="BF"/>
@@ -16349,7 +16532,7 @@
     <w:basedOn w:val="DefaultParagraphFont"/>
     <w:link w:val="IntenseQuote"/>
     <w:uiPriority w:val="30"/>
-    <w:rsid w:val="006B332D"/>
+    <w:rsid w:val="009D5B8E"/>
     <w:rPr>
       <w:i/>
       <w:iCs/>
@@ -16361,7 +16544,7 @@
     <w:basedOn w:val="DefaultParagraphFont"/>
     <w:uiPriority w:val="32"/>
     <w:qFormat/>
-    <w:rsid w:val="006B332D"/>
+    <w:rsid w:val="009D5B8E"/>
     <w:rPr>
       <w:b/>
       <w:bCs/>
@@ -16377,7 +16560,7 @@
     <w:autoRedefine/>
     <w:uiPriority w:val="39"/>
     <w:unhideWhenUsed/>
-    <w:rsid w:val="006B332D"/>
+    <w:rsid w:val="009D5B8E"/>
     <w:pPr>
       <w:spacing w:after="100"/>
     </w:pPr>
@@ -16388,7 +16571,7 @@
     <w:link w:val="HeaderChar"/>
     <w:uiPriority w:val="99"/>
     <w:unhideWhenUsed/>
-    <w:rsid w:val="006B332D"/>
+    <w:rsid w:val="009D5B8E"/>
     <w:pPr>
       <w:tabs>
         <w:tab w:val="center" w:pos="4680"/>
@@ -16402,7 +16585,7 @@
     <w:basedOn w:val="DefaultParagraphFont"/>
     <w:link w:val="Header"/>
     <w:uiPriority w:val="99"/>
-    <w:rsid w:val="006B332D"/>
+    <w:rsid w:val="009D5B8E"/>
     <w:rPr>
       <w:rFonts w:ascii="Times New Roman" w:hAnsi="Times New Roman" w:cs="Times New Roman"/>
       <w:sz w:val="28"/>
@@ -16414,7 +16597,7 @@
     <w:link w:val="FooterChar"/>
     <w:uiPriority w:val="99"/>
     <w:unhideWhenUsed/>
-    <w:rsid w:val="006B332D"/>
+    <w:rsid w:val="009D5B8E"/>
     <w:pPr>
       <w:tabs>
         <w:tab w:val="center" w:pos="4680"/>
@@ -16428,7 +16611,7 @@
     <w:basedOn w:val="DefaultParagraphFont"/>
     <w:link w:val="Footer"/>
     <w:uiPriority w:val="99"/>
-    <w:rsid w:val="006B332D"/>
+    <w:rsid w:val="009D5B8E"/>
     <w:rPr>
       <w:rFonts w:ascii="Times New Roman" w:hAnsi="Times New Roman" w:cs="Times New Roman"/>
       <w:sz w:val="28"/>
@@ -16440,7 +16623,7 @@
     <w:uiPriority w:val="99"/>
     <w:semiHidden/>
     <w:unhideWhenUsed/>
-    <w:rsid w:val="006B332D"/>
+    <w:rsid w:val="009D5B8E"/>
   </w:style>
   <w:style w:type="paragraph" w:styleId="TOC2">
     <w:name w:val="toc 2"/>
@@ -16449,7 +16632,7 @@
     <w:autoRedefine/>
     <w:uiPriority w:val="39"/>
     <w:unhideWhenUsed/>
-    <w:rsid w:val="006B332D"/>
+    <w:rsid w:val="009D5B8E"/>
     <w:pPr>
       <w:spacing w:after="100"/>
       <w:ind w:left="280"/>
@@ -16462,7 +16645,7 @@
     <w:autoRedefine/>
     <w:uiPriority w:val="39"/>
     <w:unhideWhenUsed/>
-    <w:rsid w:val="006B332D"/>
+    <w:rsid w:val="009D5B8E"/>
     <w:pPr>
       <w:spacing w:after="100"/>
       <w:ind w:left="560"/>

</xml_diff>